<commit_message>
Stage 5 - Cart price total
</commit_message>
<xml_diff>
--- a/JM - Shop Documentation.docx
+++ b/JM - Shop Documentation.docx
@@ -4003,13 +4003,7 @@
           <w:p/>
           <w:p>
             <w:r>
-              <w:t>2</w:t>
-            </w:r>
-            <w:r>
-              <w:t>8</w:t>
-            </w:r>
-            <w:r>
-              <w:t>/10/26</w:t>
+              <w:t>28/10/26</w:t>
             </w:r>
           </w:p>
         </w:tc>
@@ -4619,6 +4613,556 @@
           <w:p/>
         </w:tc>
       </w:tr>
+      <w:tr>
+        <w:tc>
+          <w:tcPr>
+            <w:tcW w:w="1366" w:type="dxa"/>
+          </w:tcPr>
+          <w:p>
+            <w:r>
+              <w:t>VID36</w:t>
+            </w:r>
+          </w:p>
+        </w:tc>
+        <w:tc>
+          <w:tcPr>
+            <w:tcW w:w="1308" w:type="dxa"/>
+          </w:tcPr>
+          <w:p>
+            <w:pPr>
+              <w:tabs>
+                <w:tab w:val="left" w:pos="837"/>
+              </w:tabs>
+            </w:pPr>
+            <w:r>
+              <w:t xml:space="preserve">Here I </w:t>
+            </w:r>
+            <w:r>
+              <w:t>started the area to total the cost of all the items in the cart</w:t>
+            </w:r>
+          </w:p>
+        </w:tc>
+        <w:tc>
+          <w:tcPr>
+            <w:tcW w:w="4949" w:type="dxa"/>
+          </w:tcPr>
+          <w:p>
+            <w:pPr>
+              <w:rPr>
+                <w:noProof/>
+              </w:rPr>
+            </w:pPr>
+            <w:r>
+              <w:rPr>
+                <w:noProof/>
+              </w:rPr>
+              <w:drawing>
+                <wp:inline distT="0" distB="0" distL="0" distR="0" wp14:anchorId="7AF3ACA6" wp14:editId="71334E58">
+                  <wp:extent cx="2429214" cy="952633"/>
+                  <wp:effectExtent l="0" t="0" r="9525" b="0"/>
+                  <wp:docPr id="385303650" name="Picture 1"/>
+                  <wp:cNvGraphicFramePr>
+                    <a:graphicFrameLocks xmlns:a="http://schemas.openxmlformats.org/drawingml/2006/main" noChangeAspect="1"/>
+                  </wp:cNvGraphicFramePr>
+                  <a:graphic xmlns:a="http://schemas.openxmlformats.org/drawingml/2006/main">
+                    <a:graphicData uri="http://schemas.openxmlformats.org/drawingml/2006/picture">
+                      <pic:pic xmlns:pic="http://schemas.openxmlformats.org/drawingml/2006/picture">
+                        <pic:nvPicPr>
+                          <pic:cNvPr id="385303650" name=""/>
+                          <pic:cNvPicPr/>
+                        </pic:nvPicPr>
+                        <pic:blipFill>
+                          <a:blip r:embed="rId62"/>
+                          <a:stretch>
+                            <a:fillRect/>
+                          </a:stretch>
+                        </pic:blipFill>
+                        <pic:spPr>
+                          <a:xfrm>
+                            <a:off x="0" y="0"/>
+                            <a:ext cx="2429214" cy="952633"/>
+                          </a:xfrm>
+                          <a:prstGeom prst="rect">
+                            <a:avLst/>
+                          </a:prstGeom>
+                        </pic:spPr>
+                      </pic:pic>
+                    </a:graphicData>
+                  </a:graphic>
+                </wp:inline>
+              </w:drawing>
+            </w:r>
+          </w:p>
+          <w:p>
+            <w:pPr>
+              <w:rPr>
+                <w:noProof/>
+              </w:rPr>
+            </w:pPr>
+            <w:r>
+              <w:rPr>
+                <w:noProof/>
+              </w:rPr>
+              <w:drawing>
+                <wp:inline distT="0" distB="0" distL="0" distR="0" wp14:anchorId="3DADDFED" wp14:editId="6CF8230E">
+                  <wp:extent cx="2964379" cy="922587"/>
+                  <wp:effectExtent l="0" t="0" r="7620" b="0"/>
+                  <wp:docPr id="350892833" name="Picture 1"/>
+                  <wp:cNvGraphicFramePr>
+                    <a:graphicFrameLocks xmlns:a="http://schemas.openxmlformats.org/drawingml/2006/main" noChangeAspect="1"/>
+                  </wp:cNvGraphicFramePr>
+                  <a:graphic xmlns:a="http://schemas.openxmlformats.org/drawingml/2006/main">
+                    <a:graphicData uri="http://schemas.openxmlformats.org/drawingml/2006/picture">
+                      <pic:pic xmlns:pic="http://schemas.openxmlformats.org/drawingml/2006/picture">
+                        <pic:nvPicPr>
+                          <pic:cNvPr id="350892833" name=""/>
+                          <pic:cNvPicPr/>
+                        </pic:nvPicPr>
+                        <pic:blipFill>
+                          <a:blip r:embed="rId63"/>
+                          <a:stretch>
+                            <a:fillRect/>
+                          </a:stretch>
+                        </pic:blipFill>
+                        <pic:spPr>
+                          <a:xfrm>
+                            <a:off x="0" y="0"/>
+                            <a:ext cx="2979165" cy="927189"/>
+                          </a:xfrm>
+                          <a:prstGeom prst="rect">
+                            <a:avLst/>
+                          </a:prstGeom>
+                        </pic:spPr>
+                      </pic:pic>
+                    </a:graphicData>
+                  </a:graphic>
+                </wp:inline>
+              </w:drawing>
+            </w:r>
+          </w:p>
+          <w:p>
+            <w:pPr>
+              <w:rPr>
+                <w:noProof/>
+              </w:rPr>
+            </w:pPr>
+            <w:r>
+              <w:rPr>
+                <w:noProof/>
+              </w:rPr>
+              <w:lastRenderedPageBreak/>
+              <w:drawing>
+                <wp:inline distT="0" distB="0" distL="0" distR="0" wp14:anchorId="0EB68789" wp14:editId="40EB811D">
+                  <wp:extent cx="2621740" cy="926276"/>
+                  <wp:effectExtent l="0" t="0" r="7620" b="7620"/>
+                  <wp:docPr id="702215133" name="Picture 1"/>
+                  <wp:cNvGraphicFramePr>
+                    <a:graphicFrameLocks xmlns:a="http://schemas.openxmlformats.org/drawingml/2006/main" noChangeAspect="1"/>
+                  </wp:cNvGraphicFramePr>
+                  <a:graphic xmlns:a="http://schemas.openxmlformats.org/drawingml/2006/main">
+                    <a:graphicData uri="http://schemas.openxmlformats.org/drawingml/2006/picture">
+                      <pic:pic xmlns:pic="http://schemas.openxmlformats.org/drawingml/2006/picture">
+                        <pic:nvPicPr>
+                          <pic:cNvPr id="702215133" name=""/>
+                          <pic:cNvPicPr/>
+                        </pic:nvPicPr>
+                        <pic:blipFill>
+                          <a:blip r:embed="rId64"/>
+                          <a:stretch>
+                            <a:fillRect/>
+                          </a:stretch>
+                        </pic:blipFill>
+                        <pic:spPr>
+                          <a:xfrm>
+                            <a:off x="0" y="0"/>
+                            <a:ext cx="2663208" cy="940927"/>
+                          </a:xfrm>
+                          <a:prstGeom prst="rect">
+                            <a:avLst/>
+                          </a:prstGeom>
+                        </pic:spPr>
+                      </pic:pic>
+                    </a:graphicData>
+                  </a:graphic>
+                </wp:inline>
+              </w:drawing>
+            </w:r>
+          </w:p>
+        </w:tc>
+        <w:tc>
+          <w:tcPr>
+            <w:tcW w:w="1393" w:type="dxa"/>
+          </w:tcPr>
+          <w:p>
+            <w:r>
+              <w:lastRenderedPageBreak/>
+              <w:t>Tested in TID11</w:t>
+            </w:r>
+          </w:p>
+        </w:tc>
+      </w:tr>
+      <w:tr>
+        <w:tc>
+          <w:tcPr>
+            <w:tcW w:w="1366" w:type="dxa"/>
+          </w:tcPr>
+          <w:p>
+            <w:r>
+              <w:t>VID37</w:t>
+            </w:r>
+          </w:p>
+        </w:tc>
+        <w:tc>
+          <w:tcPr>
+            <w:tcW w:w="1308" w:type="dxa"/>
+          </w:tcPr>
+          <w:p>
+            <w:pPr>
+              <w:tabs>
+                <w:tab w:val="left" w:pos="837"/>
+              </w:tabs>
+            </w:pPr>
+            <w:r>
+              <w:t xml:space="preserve">Here I added the new </w:t>
+            </w:r>
+            <w:r>
+              <w:t>price label to the list of items in the users cart.</w:t>
+            </w:r>
+          </w:p>
+        </w:tc>
+        <w:tc>
+          <w:tcPr>
+            <w:tcW w:w="4949" w:type="dxa"/>
+          </w:tcPr>
+          <w:p>
+            <w:pPr>
+              <w:rPr>
+                <w:noProof/>
+              </w:rPr>
+            </w:pPr>
+            <w:r>
+              <w:rPr>
+                <w:noProof/>
+              </w:rPr>
+              <w:t>Before:</w:t>
+            </w:r>
+          </w:p>
+          <w:p>
+            <w:pPr>
+              <w:rPr>
+                <w:noProof/>
+              </w:rPr>
+            </w:pPr>
+            <w:r>
+              <w:rPr>
+                <w:noProof/>
+              </w:rPr>
+              <w:drawing>
+                <wp:inline distT="0" distB="0" distL="0" distR="0" wp14:anchorId="7B64EE1B" wp14:editId="6D4182AE">
+                  <wp:extent cx="2838203" cy="219449"/>
+                  <wp:effectExtent l="0" t="0" r="635" b="9525"/>
+                  <wp:docPr id="1147618123" name="Picture 1"/>
+                  <wp:cNvGraphicFramePr>
+                    <a:graphicFrameLocks xmlns:a="http://schemas.openxmlformats.org/drawingml/2006/main" noChangeAspect="1"/>
+                  </wp:cNvGraphicFramePr>
+                  <a:graphic xmlns:a="http://schemas.openxmlformats.org/drawingml/2006/main">
+                    <a:graphicData uri="http://schemas.openxmlformats.org/drawingml/2006/picture">
+                      <pic:pic xmlns:pic="http://schemas.openxmlformats.org/drawingml/2006/picture">
+                        <pic:nvPicPr>
+                          <pic:cNvPr id="1147618123" name=""/>
+                          <pic:cNvPicPr/>
+                        </pic:nvPicPr>
+                        <pic:blipFill>
+                          <a:blip r:embed="rId65"/>
+                          <a:stretch>
+                            <a:fillRect/>
+                          </a:stretch>
+                        </pic:blipFill>
+                        <pic:spPr>
+                          <a:xfrm>
+                            <a:off x="0" y="0"/>
+                            <a:ext cx="2872120" cy="222071"/>
+                          </a:xfrm>
+                          <a:prstGeom prst="rect">
+                            <a:avLst/>
+                          </a:prstGeom>
+                        </pic:spPr>
+                      </pic:pic>
+                    </a:graphicData>
+                  </a:graphic>
+                </wp:inline>
+              </w:drawing>
+            </w:r>
+          </w:p>
+          <w:p>
+            <w:pPr>
+              <w:rPr>
+                <w:noProof/>
+              </w:rPr>
+            </w:pPr>
+            <w:r>
+              <w:rPr>
+                <w:noProof/>
+              </w:rPr>
+              <w:drawing>
+                <wp:inline distT="0" distB="0" distL="0" distR="0" wp14:anchorId="53206CBA" wp14:editId="1DF8079F">
+                  <wp:extent cx="2753109" cy="342948"/>
+                  <wp:effectExtent l="0" t="0" r="0" b="0"/>
+                  <wp:docPr id="1904881024" name="Picture 1"/>
+                  <wp:cNvGraphicFramePr>
+                    <a:graphicFrameLocks xmlns:a="http://schemas.openxmlformats.org/drawingml/2006/main" noChangeAspect="1"/>
+                  </wp:cNvGraphicFramePr>
+                  <a:graphic xmlns:a="http://schemas.openxmlformats.org/drawingml/2006/main">
+                    <a:graphicData uri="http://schemas.openxmlformats.org/drawingml/2006/picture">
+                      <pic:pic xmlns:pic="http://schemas.openxmlformats.org/drawingml/2006/picture">
+                        <pic:nvPicPr>
+                          <pic:cNvPr id="1904881024" name=""/>
+                          <pic:cNvPicPr/>
+                        </pic:nvPicPr>
+                        <pic:blipFill>
+                          <a:blip r:embed="rId66"/>
+                          <a:stretch>
+                            <a:fillRect/>
+                          </a:stretch>
+                        </pic:blipFill>
+                        <pic:spPr>
+                          <a:xfrm>
+                            <a:off x="0" y="0"/>
+                            <a:ext cx="2753109" cy="342948"/>
+                          </a:xfrm>
+                          <a:prstGeom prst="rect">
+                            <a:avLst/>
+                          </a:prstGeom>
+                        </pic:spPr>
+                      </pic:pic>
+                    </a:graphicData>
+                  </a:graphic>
+                </wp:inline>
+              </w:drawing>
+            </w:r>
+          </w:p>
+          <w:p>
+            <w:pPr>
+              <w:rPr>
+                <w:noProof/>
+              </w:rPr>
+            </w:pPr>
+            <w:r>
+              <w:rPr>
+                <w:noProof/>
+              </w:rPr>
+              <w:t>After</w:t>
+            </w:r>
+            <w:r>
+              <w:rPr>
+                <w:noProof/>
+              </w:rPr>
+              <w:t>:</w:t>
+            </w:r>
+          </w:p>
+          <w:p>
+            <w:pPr>
+              <w:rPr>
+                <w:noProof/>
+              </w:rPr>
+            </w:pPr>
+            <w:r>
+              <w:rPr>
+                <w:noProof/>
+              </w:rPr>
+              <w:drawing>
+                <wp:inline distT="0" distB="0" distL="0" distR="0" wp14:anchorId="02C8D642" wp14:editId="6DD04185">
+                  <wp:extent cx="2838203" cy="219449"/>
+                  <wp:effectExtent l="0" t="0" r="635" b="9525"/>
+                  <wp:docPr id="1606065151" name="Picture 1"/>
+                  <wp:cNvGraphicFramePr>
+                    <a:graphicFrameLocks xmlns:a="http://schemas.openxmlformats.org/drawingml/2006/main" noChangeAspect="1"/>
+                  </wp:cNvGraphicFramePr>
+                  <a:graphic xmlns:a="http://schemas.openxmlformats.org/drawingml/2006/main">
+                    <a:graphicData uri="http://schemas.openxmlformats.org/drawingml/2006/picture">
+                      <pic:pic xmlns:pic="http://schemas.openxmlformats.org/drawingml/2006/picture">
+                        <pic:nvPicPr>
+                          <pic:cNvPr id="1147618123" name=""/>
+                          <pic:cNvPicPr/>
+                        </pic:nvPicPr>
+                        <pic:blipFill>
+                          <a:blip r:embed="rId65"/>
+                          <a:stretch>
+                            <a:fillRect/>
+                          </a:stretch>
+                        </pic:blipFill>
+                        <pic:spPr>
+                          <a:xfrm>
+                            <a:off x="0" y="0"/>
+                            <a:ext cx="2872120" cy="222071"/>
+                          </a:xfrm>
+                          <a:prstGeom prst="rect">
+                            <a:avLst/>
+                          </a:prstGeom>
+                        </pic:spPr>
+                      </pic:pic>
+                    </a:graphicData>
+                  </a:graphic>
+                </wp:inline>
+              </w:drawing>
+            </w:r>
+          </w:p>
+          <w:p>
+            <w:pPr>
+              <w:rPr>
+                <w:noProof/>
+              </w:rPr>
+            </w:pPr>
+            <w:r>
+              <w:rPr>
+                <w:noProof/>
+              </w:rPr>
+              <w:drawing>
+                <wp:inline distT="0" distB="0" distL="0" distR="0" wp14:anchorId="54B413EA" wp14:editId="1B6CD7C5">
+                  <wp:extent cx="2753109" cy="342948"/>
+                  <wp:effectExtent l="0" t="0" r="0" b="0"/>
+                  <wp:docPr id="2049408324" name="Picture 1"/>
+                  <wp:cNvGraphicFramePr>
+                    <a:graphicFrameLocks xmlns:a="http://schemas.openxmlformats.org/drawingml/2006/main" noChangeAspect="1"/>
+                  </wp:cNvGraphicFramePr>
+                  <a:graphic xmlns:a="http://schemas.openxmlformats.org/drawingml/2006/main">
+                    <a:graphicData uri="http://schemas.openxmlformats.org/drawingml/2006/picture">
+                      <pic:pic xmlns:pic="http://schemas.openxmlformats.org/drawingml/2006/picture">
+                        <pic:nvPicPr>
+                          <pic:cNvPr id="1904881024" name=""/>
+                          <pic:cNvPicPr/>
+                        </pic:nvPicPr>
+                        <pic:blipFill>
+                          <a:blip r:embed="rId66"/>
+                          <a:stretch>
+                            <a:fillRect/>
+                          </a:stretch>
+                        </pic:blipFill>
+                        <pic:spPr>
+                          <a:xfrm>
+                            <a:off x="0" y="0"/>
+                            <a:ext cx="2753109" cy="342948"/>
+                          </a:xfrm>
+                          <a:prstGeom prst="rect">
+                            <a:avLst/>
+                          </a:prstGeom>
+                        </pic:spPr>
+                      </pic:pic>
+                    </a:graphicData>
+                  </a:graphic>
+                </wp:inline>
+              </w:drawing>
+            </w:r>
+          </w:p>
+          <w:p>
+            <w:pPr>
+              <w:rPr>
+                <w:noProof/>
+              </w:rPr>
+            </w:pPr>
+            <w:r>
+              <w:rPr>
+                <w:noProof/>
+              </w:rPr>
+              <w:drawing>
+                <wp:inline distT="0" distB="0" distL="0" distR="0" wp14:anchorId="653B07E5" wp14:editId="24AAD773">
+                  <wp:extent cx="1933845" cy="390580"/>
+                  <wp:effectExtent l="0" t="0" r="0" b="9525"/>
+                  <wp:docPr id="602989391" name="Picture 1"/>
+                  <wp:cNvGraphicFramePr>
+                    <a:graphicFrameLocks xmlns:a="http://schemas.openxmlformats.org/drawingml/2006/main" noChangeAspect="1"/>
+                  </wp:cNvGraphicFramePr>
+                  <a:graphic xmlns:a="http://schemas.openxmlformats.org/drawingml/2006/main">
+                    <a:graphicData uri="http://schemas.openxmlformats.org/drawingml/2006/picture">
+                      <pic:pic xmlns:pic="http://schemas.openxmlformats.org/drawingml/2006/picture">
+                        <pic:nvPicPr>
+                          <pic:cNvPr id="602989391" name=""/>
+                          <pic:cNvPicPr/>
+                        </pic:nvPicPr>
+                        <pic:blipFill>
+                          <a:blip r:embed="rId67"/>
+                          <a:stretch>
+                            <a:fillRect/>
+                          </a:stretch>
+                        </pic:blipFill>
+                        <pic:spPr>
+                          <a:xfrm>
+                            <a:off x="0" y="0"/>
+                            <a:ext cx="1933845" cy="390580"/>
+                          </a:xfrm>
+                          <a:prstGeom prst="rect">
+                            <a:avLst/>
+                          </a:prstGeom>
+                        </pic:spPr>
+                      </pic:pic>
+                    </a:graphicData>
+                  </a:graphic>
+                </wp:inline>
+              </w:drawing>
+            </w:r>
+          </w:p>
+          <w:p>
+            <w:pPr>
+              <w:rPr>
+                <w:noProof/>
+              </w:rPr>
+            </w:pPr>
+          </w:p>
+          <w:p>
+            <w:pPr>
+              <w:rPr>
+                <w:noProof/>
+              </w:rPr>
+            </w:pPr>
+            <w:r>
+              <w:rPr>
+                <w:noProof/>
+              </w:rPr>
+              <w:drawing>
+                <wp:inline distT="0" distB="0" distL="0" distR="0" wp14:anchorId="41C3FD9C" wp14:editId="77A8783D">
+                  <wp:extent cx="2836718" cy="2066251"/>
+                  <wp:effectExtent l="0" t="0" r="1905" b="0"/>
+                  <wp:docPr id="1074165095" name="Picture 1"/>
+                  <wp:cNvGraphicFramePr>
+                    <a:graphicFrameLocks xmlns:a="http://schemas.openxmlformats.org/drawingml/2006/main" noChangeAspect="1"/>
+                  </wp:cNvGraphicFramePr>
+                  <a:graphic xmlns:a="http://schemas.openxmlformats.org/drawingml/2006/main">
+                    <a:graphicData uri="http://schemas.openxmlformats.org/drawingml/2006/picture">
+                      <pic:pic xmlns:pic="http://schemas.openxmlformats.org/drawingml/2006/picture">
+                        <pic:nvPicPr>
+                          <pic:cNvPr id="1074165095" name=""/>
+                          <pic:cNvPicPr/>
+                        </pic:nvPicPr>
+                        <pic:blipFill>
+                          <a:blip r:embed="rId68"/>
+                          <a:stretch>
+                            <a:fillRect/>
+                          </a:stretch>
+                        </pic:blipFill>
+                        <pic:spPr>
+                          <a:xfrm>
+                            <a:off x="0" y="0"/>
+                            <a:ext cx="2842613" cy="2070545"/>
+                          </a:xfrm>
+                          <a:prstGeom prst="rect">
+                            <a:avLst/>
+                          </a:prstGeom>
+                        </pic:spPr>
+                      </pic:pic>
+                    </a:graphicData>
+                  </a:graphic>
+                </wp:inline>
+              </w:drawing>
+            </w:r>
+          </w:p>
+        </w:tc>
+        <w:tc>
+          <w:tcPr>
+            <w:tcW w:w="1393" w:type="dxa"/>
+          </w:tcPr>
+          <w:p/>
+        </w:tc>
+      </w:tr>
     </w:tbl>
     <w:p/>
     <w:p>
@@ -4636,18 +5180,18 @@
         <w:tblLook w:val="04A0" w:firstRow="1" w:lastRow="0" w:firstColumn="1" w:lastColumn="0" w:noHBand="0" w:noVBand="1"/>
       </w:tblPr>
       <w:tblGrid>
-        <w:gridCol w:w="852"/>
-        <w:gridCol w:w="972"/>
-        <w:gridCol w:w="684"/>
-        <w:gridCol w:w="585"/>
-        <w:gridCol w:w="972"/>
-        <w:gridCol w:w="3943"/>
-        <w:gridCol w:w="1008"/>
+        <w:gridCol w:w="977"/>
+        <w:gridCol w:w="1118"/>
+        <w:gridCol w:w="930"/>
+        <w:gridCol w:w="656"/>
+        <w:gridCol w:w="1269"/>
+        <w:gridCol w:w="2904"/>
+        <w:gridCol w:w="1162"/>
       </w:tblGrid>
       <w:tr>
         <w:tc>
           <w:tcPr>
-            <w:tcW w:w="812" w:type="dxa"/>
+            <w:tcW w:w="852" w:type="dxa"/>
           </w:tcPr>
           <w:p>
             <w:r>
@@ -4657,7 +5201,7 @@
         </w:tc>
         <w:tc>
           <w:tcPr>
-            <w:tcW w:w="1206" w:type="dxa"/>
+            <w:tcW w:w="972" w:type="dxa"/>
           </w:tcPr>
           <w:p>
             <w:r>
@@ -4667,7 +5211,7 @@
         </w:tc>
         <w:tc>
           <w:tcPr>
-            <w:tcW w:w="673" w:type="dxa"/>
+            <w:tcW w:w="684" w:type="dxa"/>
           </w:tcPr>
           <w:p>
             <w:r>
@@ -4677,7 +5221,7 @@
         </w:tc>
         <w:tc>
           <w:tcPr>
-            <w:tcW w:w="699" w:type="dxa"/>
+            <w:tcW w:w="585" w:type="dxa"/>
           </w:tcPr>
           <w:p>
             <w:r>
@@ -4687,7 +5231,7 @@
         </w:tc>
         <w:tc>
           <w:tcPr>
-            <w:tcW w:w="1206" w:type="dxa"/>
+            <w:tcW w:w="972" w:type="dxa"/>
           </w:tcPr>
           <w:p>
             <w:r>
@@ -4697,7 +5241,7 @@
         </w:tc>
         <w:tc>
           <w:tcPr>
-            <w:tcW w:w="3166" w:type="dxa"/>
+            <w:tcW w:w="3943" w:type="dxa"/>
           </w:tcPr>
           <w:p>
             <w:r>
@@ -4707,7 +5251,7 @@
         </w:tc>
         <w:tc>
           <w:tcPr>
-            <w:tcW w:w="1254" w:type="dxa"/>
+            <w:tcW w:w="1008" w:type="dxa"/>
           </w:tcPr>
           <w:p>
             <w:r>
@@ -4719,7 +5263,7 @@
       <w:tr>
         <w:tc>
           <w:tcPr>
-            <w:tcW w:w="812" w:type="dxa"/>
+            <w:tcW w:w="852" w:type="dxa"/>
           </w:tcPr>
           <w:p>
             <w:r>
@@ -4729,32 +5273,27 @@
         </w:tc>
         <w:tc>
           <w:tcPr>
-            <w:tcW w:w="1206" w:type="dxa"/>
-          </w:tcPr>
-          <w:p>
-            <w:r>
-              <w:t xml:space="preserve">Does the code fetch </w:t>
-            </w:r>
-            <w:r>
-              <w:lastRenderedPageBreak/>
-              <w:t>and log an array</w:t>
-            </w:r>
-          </w:p>
-        </w:tc>
-        <w:tc>
-          <w:tcPr>
-            <w:tcW w:w="673" w:type="dxa"/>
-          </w:tcPr>
-          <w:p>
-            <w:r>
-              <w:lastRenderedPageBreak/>
+            <w:tcW w:w="972" w:type="dxa"/>
+          </w:tcPr>
+          <w:p>
+            <w:r>
+              <w:t>Does the code fetch and log an array</w:t>
+            </w:r>
+          </w:p>
+        </w:tc>
+        <w:tc>
+          <w:tcPr>
+            <w:tcW w:w="684" w:type="dxa"/>
+          </w:tcPr>
+          <w:p>
+            <w:r>
               <w:t>N/A</w:t>
             </w:r>
           </w:p>
         </w:tc>
         <w:tc>
           <w:tcPr>
-            <w:tcW w:w="699" w:type="dxa"/>
+            <w:tcW w:w="585" w:type="dxa"/>
           </w:tcPr>
           <w:p>
             <w:r>
@@ -4764,32 +5303,27 @@
         </w:tc>
         <w:tc>
           <w:tcPr>
-            <w:tcW w:w="1206" w:type="dxa"/>
-          </w:tcPr>
-          <w:p>
-            <w:r>
-              <w:t xml:space="preserve">An array is visible in the </w:t>
-            </w:r>
-            <w:r>
-              <w:lastRenderedPageBreak/>
-              <w:t>console</w:t>
-            </w:r>
-          </w:p>
-        </w:tc>
-        <w:tc>
-          <w:tcPr>
-            <w:tcW w:w="3166" w:type="dxa"/>
-          </w:tcPr>
-          <w:p>
-            <w:r>
-              <w:lastRenderedPageBreak/>
+            <w:tcW w:w="972" w:type="dxa"/>
+          </w:tcPr>
+          <w:p>
+            <w:r>
+              <w:t>An array is visible in the console</w:t>
+            </w:r>
+          </w:p>
+        </w:tc>
+        <w:tc>
+          <w:tcPr>
+            <w:tcW w:w="3943" w:type="dxa"/>
+          </w:tcPr>
+          <w:p>
+            <w:r>
               <w:t>An error is thrown on line 4</w:t>
             </w:r>
           </w:p>
         </w:tc>
         <w:tc>
           <w:tcPr>
-            <w:tcW w:w="1254" w:type="dxa"/>
+            <w:tcW w:w="1008" w:type="dxa"/>
           </w:tcPr>
           <w:p/>
         </w:tc>
@@ -4797,7 +5331,7 @@
       <w:tr>
         <w:tc>
           <w:tcPr>
-            <w:tcW w:w="812" w:type="dxa"/>
+            <w:tcW w:w="852" w:type="dxa"/>
           </w:tcPr>
           <w:p>
             <w:r>
@@ -4807,7 +5341,7 @@
         </w:tc>
         <w:tc>
           <w:tcPr>
-            <w:tcW w:w="1206" w:type="dxa"/>
+            <w:tcW w:w="972" w:type="dxa"/>
           </w:tcPr>
           <w:p>
             <w:r>
@@ -4817,7 +5351,7 @@
         </w:tc>
         <w:tc>
           <w:tcPr>
-            <w:tcW w:w="673" w:type="dxa"/>
+            <w:tcW w:w="684" w:type="dxa"/>
           </w:tcPr>
           <w:p>
             <w:r>
@@ -4827,7 +5361,7 @@
         </w:tc>
         <w:tc>
           <w:tcPr>
-            <w:tcW w:w="699" w:type="dxa"/>
+            <w:tcW w:w="585" w:type="dxa"/>
           </w:tcPr>
           <w:p>
             <w:r>
@@ -4837,7 +5371,7 @@
         </w:tc>
         <w:tc>
           <w:tcPr>
-            <w:tcW w:w="1206" w:type="dxa"/>
+            <w:tcW w:w="972" w:type="dxa"/>
           </w:tcPr>
           <w:p>
             <w:r>
@@ -4847,7 +5381,7 @@
         </w:tc>
         <w:tc>
           <w:tcPr>
-            <w:tcW w:w="3166" w:type="dxa"/>
+            <w:tcW w:w="3943" w:type="dxa"/>
           </w:tcPr>
           <w:p>
             <w:r>
@@ -4860,7 +5394,7 @@
         </w:tc>
         <w:tc>
           <w:tcPr>
-            <w:tcW w:w="1254" w:type="dxa"/>
+            <w:tcW w:w="1008" w:type="dxa"/>
           </w:tcPr>
           <w:p/>
         </w:tc>
@@ -4868,17 +5402,18 @@
       <w:tr>
         <w:tc>
           <w:tcPr>
-            <w:tcW w:w="812" w:type="dxa"/>
-          </w:tcPr>
-          <w:p>
-            <w:r>
+            <w:tcW w:w="852" w:type="dxa"/>
+          </w:tcPr>
+          <w:p>
+            <w:r>
+              <w:lastRenderedPageBreak/>
               <w:t>TID1.2</w:t>
             </w:r>
           </w:p>
         </w:tc>
         <w:tc>
           <w:tcPr>
-            <w:tcW w:w="1206" w:type="dxa"/>
+            <w:tcW w:w="972" w:type="dxa"/>
           </w:tcPr>
           <w:p>
             <w:r>
@@ -4888,7 +5423,7 @@
         </w:tc>
         <w:tc>
           <w:tcPr>
-            <w:tcW w:w="673" w:type="dxa"/>
+            <w:tcW w:w="684" w:type="dxa"/>
           </w:tcPr>
           <w:p>
             <w:r>
@@ -4898,7 +5433,7 @@
         </w:tc>
         <w:tc>
           <w:tcPr>
-            <w:tcW w:w="699" w:type="dxa"/>
+            <w:tcW w:w="585" w:type="dxa"/>
           </w:tcPr>
           <w:p>
             <w:r>
@@ -4908,7 +5443,7 @@
         </w:tc>
         <w:tc>
           <w:tcPr>
-            <w:tcW w:w="1206" w:type="dxa"/>
+            <w:tcW w:w="972" w:type="dxa"/>
           </w:tcPr>
           <w:p>
             <w:r>
@@ -4918,7 +5453,7 @@
         </w:tc>
         <w:tc>
           <w:tcPr>
-            <w:tcW w:w="3166" w:type="dxa"/>
+            <w:tcW w:w="3943" w:type="dxa"/>
           </w:tcPr>
           <w:p>
             <w:r>
@@ -4928,7 +5463,7 @@
         </w:tc>
         <w:tc>
           <w:tcPr>
-            <w:tcW w:w="1254" w:type="dxa"/>
+            <w:tcW w:w="1008" w:type="dxa"/>
           </w:tcPr>
           <w:p/>
         </w:tc>
@@ -4936,7 +5471,7 @@
       <w:tr>
         <w:tc>
           <w:tcPr>
-            <w:tcW w:w="812" w:type="dxa"/>
+            <w:tcW w:w="852" w:type="dxa"/>
           </w:tcPr>
           <w:p>
             <w:r>
@@ -4946,7 +5481,7 @@
         </w:tc>
         <w:tc>
           <w:tcPr>
-            <w:tcW w:w="1206" w:type="dxa"/>
+            <w:tcW w:w="972" w:type="dxa"/>
           </w:tcPr>
           <w:p>
             <w:r>
@@ -4959,7 +5494,7 @@
         </w:tc>
         <w:tc>
           <w:tcPr>
-            <w:tcW w:w="673" w:type="dxa"/>
+            <w:tcW w:w="684" w:type="dxa"/>
           </w:tcPr>
           <w:p>
             <w:r>
@@ -4969,7 +5504,7 @@
         </w:tc>
         <w:tc>
           <w:tcPr>
-            <w:tcW w:w="699" w:type="dxa"/>
+            <w:tcW w:w="585" w:type="dxa"/>
           </w:tcPr>
           <w:p>
             <w:r>
@@ -4979,7 +5514,7 @@
         </w:tc>
         <w:tc>
           <w:tcPr>
-            <w:tcW w:w="1206" w:type="dxa"/>
+            <w:tcW w:w="972" w:type="dxa"/>
           </w:tcPr>
           <w:p>
             <w:r>
@@ -4989,7 +5524,7 @@
         </w:tc>
         <w:tc>
           <w:tcPr>
-            <w:tcW w:w="3166" w:type="dxa"/>
+            <w:tcW w:w="3943" w:type="dxa"/>
           </w:tcPr>
           <w:p>
             <w:r>
@@ -4999,7 +5534,7 @@
         </w:tc>
         <w:tc>
           <w:tcPr>
-            <w:tcW w:w="1254" w:type="dxa"/>
+            <w:tcW w:w="1008" w:type="dxa"/>
           </w:tcPr>
           <w:p/>
         </w:tc>
@@ -5007,7 +5542,7 @@
       <w:tr>
         <w:tc>
           <w:tcPr>
-            <w:tcW w:w="812" w:type="dxa"/>
+            <w:tcW w:w="852" w:type="dxa"/>
           </w:tcPr>
           <w:p>
             <w:r>
@@ -5017,7 +5552,7 @@
         </w:tc>
         <w:tc>
           <w:tcPr>
-            <w:tcW w:w="1206" w:type="dxa"/>
+            <w:tcW w:w="972" w:type="dxa"/>
           </w:tcPr>
           <w:p>
             <w:r>
@@ -5027,7 +5562,7 @@
         </w:tc>
         <w:tc>
           <w:tcPr>
-            <w:tcW w:w="673" w:type="dxa"/>
+            <w:tcW w:w="684" w:type="dxa"/>
           </w:tcPr>
           <w:p>
             <w:r>
@@ -5037,7 +5572,7 @@
         </w:tc>
         <w:tc>
           <w:tcPr>
-            <w:tcW w:w="699" w:type="dxa"/>
+            <w:tcW w:w="585" w:type="dxa"/>
           </w:tcPr>
           <w:p>
             <w:r>
@@ -5047,7 +5582,7 @@
         </w:tc>
         <w:tc>
           <w:tcPr>
-            <w:tcW w:w="1206" w:type="dxa"/>
+            <w:tcW w:w="972" w:type="dxa"/>
           </w:tcPr>
           <w:p>
             <w:r>
@@ -5057,7 +5592,7 @@
         </w:tc>
         <w:tc>
           <w:tcPr>
-            <w:tcW w:w="3166" w:type="dxa"/>
+            <w:tcW w:w="3943" w:type="dxa"/>
           </w:tcPr>
           <w:p>
             <w:r>
@@ -5067,7 +5602,7 @@
         </w:tc>
         <w:tc>
           <w:tcPr>
-            <w:tcW w:w="1254" w:type="dxa"/>
+            <w:tcW w:w="1008" w:type="dxa"/>
           </w:tcPr>
           <w:p/>
         </w:tc>
@@ -5075,7 +5610,7 @@
       <w:tr>
         <w:tc>
           <w:tcPr>
-            <w:tcW w:w="812" w:type="dxa"/>
+            <w:tcW w:w="852" w:type="dxa"/>
           </w:tcPr>
           <w:p>
             <w:r>
@@ -5085,32 +5620,27 @@
         </w:tc>
         <w:tc>
           <w:tcPr>
-            <w:tcW w:w="1206" w:type="dxa"/>
-          </w:tcPr>
-          <w:p>
-            <w:r>
-              <w:t xml:space="preserve">Does the ul tag update </w:t>
-            </w:r>
-            <w:r>
-              <w:lastRenderedPageBreak/>
-              <w:t>and log the console</w:t>
-            </w:r>
-          </w:p>
-        </w:tc>
-        <w:tc>
-          <w:tcPr>
-            <w:tcW w:w="673" w:type="dxa"/>
-          </w:tcPr>
-          <w:p>
-            <w:r>
-              <w:lastRenderedPageBreak/>
+            <w:tcW w:w="972" w:type="dxa"/>
+          </w:tcPr>
+          <w:p>
+            <w:r>
+              <w:t>Does the ul tag update and log the console</w:t>
+            </w:r>
+          </w:p>
+        </w:tc>
+        <w:tc>
+          <w:tcPr>
+            <w:tcW w:w="684" w:type="dxa"/>
+          </w:tcPr>
+          <w:p>
+            <w:r>
               <w:t>N/A</w:t>
             </w:r>
           </w:p>
         </w:tc>
         <w:tc>
           <w:tcPr>
-            <w:tcW w:w="699" w:type="dxa"/>
+            <w:tcW w:w="585" w:type="dxa"/>
           </w:tcPr>
           <w:p>
             <w:r>
@@ -5120,32 +5650,27 @@
         </w:tc>
         <w:tc>
           <w:tcPr>
-            <w:tcW w:w="1206" w:type="dxa"/>
-          </w:tcPr>
-          <w:p>
-            <w:r>
-              <w:t>Console logs every iteratio</w:t>
-            </w:r>
-            <w:r>
-              <w:lastRenderedPageBreak/>
-              <w:t>n of the loop and adds content relevantly</w:t>
-            </w:r>
-          </w:p>
-        </w:tc>
-        <w:tc>
-          <w:tcPr>
-            <w:tcW w:w="3166" w:type="dxa"/>
-          </w:tcPr>
-          <w:p>
-            <w:r>
-              <w:lastRenderedPageBreak/>
+            <w:tcW w:w="972" w:type="dxa"/>
+          </w:tcPr>
+          <w:p>
+            <w:r>
+              <w:t>Console logs every iteration of the loop and adds content relevantly</w:t>
+            </w:r>
+          </w:p>
+        </w:tc>
+        <w:tc>
+          <w:tcPr>
+            <w:tcW w:w="3943" w:type="dxa"/>
+          </w:tcPr>
+          <w:p>
+            <w:r>
               <w:t>Console logs for one loop but then throughs an error.</w:t>
             </w:r>
           </w:p>
         </w:tc>
         <w:tc>
           <w:tcPr>
-            <w:tcW w:w="1254" w:type="dxa"/>
+            <w:tcW w:w="1008" w:type="dxa"/>
           </w:tcPr>
           <w:p/>
         </w:tc>
@@ -5153,7 +5678,7 @@
       <w:tr>
         <w:tc>
           <w:tcPr>
-            <w:tcW w:w="812" w:type="dxa"/>
+            <w:tcW w:w="852" w:type="dxa"/>
           </w:tcPr>
           <w:p>
             <w:r>
@@ -5163,7 +5688,7 @@
         </w:tc>
         <w:tc>
           <w:tcPr>
-            <w:tcW w:w="1206" w:type="dxa"/>
+            <w:tcW w:w="972" w:type="dxa"/>
           </w:tcPr>
           <w:p>
             <w:r>
@@ -5173,7 +5698,7 @@
         </w:tc>
         <w:tc>
           <w:tcPr>
-            <w:tcW w:w="673" w:type="dxa"/>
+            <w:tcW w:w="684" w:type="dxa"/>
           </w:tcPr>
           <w:p>
             <w:r>
@@ -5183,7 +5708,7 @@
         </w:tc>
         <w:tc>
           <w:tcPr>
-            <w:tcW w:w="699" w:type="dxa"/>
+            <w:tcW w:w="585" w:type="dxa"/>
           </w:tcPr>
           <w:p>
             <w:r>
@@ -5193,7 +5718,7 @@
         </w:tc>
         <w:tc>
           <w:tcPr>
-            <w:tcW w:w="1206" w:type="dxa"/>
+            <w:tcW w:w="972" w:type="dxa"/>
           </w:tcPr>
           <w:p>
             <w:r>
@@ -5203,7 +5728,7 @@
         </w:tc>
         <w:tc>
           <w:tcPr>
-            <w:tcW w:w="3166" w:type="dxa"/>
+            <w:tcW w:w="3943" w:type="dxa"/>
           </w:tcPr>
           <w:p>
             <w:r>
@@ -5226,7 +5751,7 @@
                           <pic:cNvPicPr/>
                         </pic:nvPicPr>
                         <pic:blipFill>
-                          <a:blip r:embed="rId62"/>
+                          <a:blip r:embed="rId69"/>
                           <a:stretch>
                             <a:fillRect/>
                           </a:stretch>
@@ -5258,7 +5783,7 @@
         </w:tc>
         <w:tc>
           <w:tcPr>
-            <w:tcW w:w="1254" w:type="dxa"/>
+            <w:tcW w:w="1008" w:type="dxa"/>
           </w:tcPr>
           <w:p/>
         </w:tc>
@@ -5266,7 +5791,7 @@
       <w:tr>
         <w:tc>
           <w:tcPr>
-            <w:tcW w:w="812" w:type="dxa"/>
+            <w:tcW w:w="852" w:type="dxa"/>
           </w:tcPr>
           <w:p>
             <w:r>
@@ -5276,7 +5801,7 @@
         </w:tc>
         <w:tc>
           <w:tcPr>
-            <w:tcW w:w="1206" w:type="dxa"/>
+            <w:tcW w:w="972" w:type="dxa"/>
           </w:tcPr>
           <w:p>
             <w:r>
@@ -5286,7 +5811,7 @@
         </w:tc>
         <w:tc>
           <w:tcPr>
-            <w:tcW w:w="673" w:type="dxa"/>
+            <w:tcW w:w="684" w:type="dxa"/>
           </w:tcPr>
           <w:p>
             <w:r>
@@ -5296,7 +5821,7 @@
         </w:tc>
         <w:tc>
           <w:tcPr>
-            <w:tcW w:w="699" w:type="dxa"/>
+            <w:tcW w:w="585" w:type="dxa"/>
           </w:tcPr>
           <w:p>
             <w:r>
@@ -5306,7 +5831,7 @@
         </w:tc>
         <w:tc>
           <w:tcPr>
-            <w:tcW w:w="1206" w:type="dxa"/>
+            <w:tcW w:w="972" w:type="dxa"/>
           </w:tcPr>
           <w:p>
             <w:r>
@@ -5319,7 +5844,7 @@
         </w:tc>
         <w:tc>
           <w:tcPr>
-            <w:tcW w:w="3166" w:type="dxa"/>
+            <w:tcW w:w="3943" w:type="dxa"/>
           </w:tcPr>
           <w:p>
             <w:r>
@@ -5342,7 +5867,7 @@
                           <pic:cNvPicPr/>
                         </pic:nvPicPr>
                         <pic:blipFill>
-                          <a:blip r:embed="rId63"/>
+                          <a:blip r:embed="rId70"/>
                           <a:stretch>
                             <a:fillRect/>
                           </a:stretch>
@@ -5371,7 +5896,7 @@
         </w:tc>
         <w:tc>
           <w:tcPr>
-            <w:tcW w:w="1254" w:type="dxa"/>
+            <w:tcW w:w="1008" w:type="dxa"/>
           </w:tcPr>
           <w:p/>
         </w:tc>
@@ -5379,7 +5904,7 @@
       <w:tr>
         <w:tc>
           <w:tcPr>
-            <w:tcW w:w="812" w:type="dxa"/>
+            <w:tcW w:w="852" w:type="dxa"/>
           </w:tcPr>
           <w:p>
             <w:r>
@@ -5389,27 +5914,32 @@
         </w:tc>
         <w:tc>
           <w:tcPr>
-            <w:tcW w:w="1206" w:type="dxa"/>
-          </w:tcPr>
-          <w:p>
-            <w:r>
-              <w:t>Does the ul tag update and log the console</w:t>
-            </w:r>
-          </w:p>
-        </w:tc>
-        <w:tc>
-          <w:tcPr>
-            <w:tcW w:w="673" w:type="dxa"/>
-          </w:tcPr>
-          <w:p>
-            <w:r>
+            <w:tcW w:w="972" w:type="dxa"/>
+          </w:tcPr>
+          <w:p>
+            <w:r>
+              <w:t xml:space="preserve">Does the ul </w:t>
+            </w:r>
+            <w:r>
+              <w:lastRenderedPageBreak/>
+              <w:t>tag update and log the console</w:t>
+            </w:r>
+          </w:p>
+        </w:tc>
+        <w:tc>
+          <w:tcPr>
+            <w:tcW w:w="684" w:type="dxa"/>
+          </w:tcPr>
+          <w:p>
+            <w:r>
+              <w:lastRenderedPageBreak/>
               <w:t>N/A</w:t>
             </w:r>
           </w:p>
         </w:tc>
         <w:tc>
           <w:tcPr>
-            <w:tcW w:w="699" w:type="dxa"/>
+            <w:tcW w:w="585" w:type="dxa"/>
           </w:tcPr>
           <w:p>
             <w:r>
@@ -5419,21 +5949,30 @@
         </w:tc>
         <w:tc>
           <w:tcPr>
-            <w:tcW w:w="1206" w:type="dxa"/>
-          </w:tcPr>
-          <w:p>
-            <w:r>
-              <w:t>Console logs the contents of the selected item of the array</w:t>
-            </w:r>
-          </w:p>
-        </w:tc>
-        <w:tc>
-          <w:tcPr>
-            <w:tcW w:w="3166" w:type="dxa"/>
-          </w:tcPr>
-          <w:p>
-            <w:r>
-              <w:t>Console logs the contents of the selected item of the array</w:t>
+            <w:tcW w:w="972" w:type="dxa"/>
+          </w:tcPr>
+          <w:p>
+            <w:r>
+              <w:t xml:space="preserve">Console logs the </w:t>
+            </w:r>
+            <w:r>
+              <w:lastRenderedPageBreak/>
+              <w:t>contents of the selected item of the array</w:t>
+            </w:r>
+          </w:p>
+        </w:tc>
+        <w:tc>
+          <w:tcPr>
+            <w:tcW w:w="3943" w:type="dxa"/>
+          </w:tcPr>
+          <w:p>
+            <w:r>
+              <w:lastRenderedPageBreak/>
+              <w:t xml:space="preserve">Console logs the contents of the selected </w:t>
+            </w:r>
+            <w:r>
+              <w:lastRenderedPageBreak/>
+              <w:t>item of the array</w:t>
             </w:r>
             <w:r>
               <w:t xml:space="preserve"> </w:t>
@@ -5458,7 +5997,7 @@
                           <pic:cNvPicPr/>
                         </pic:nvPicPr>
                         <pic:blipFill>
-                          <a:blip r:embed="rId64"/>
+                          <a:blip r:embed="rId71"/>
                           <a:stretch>
                             <a:fillRect/>
                           </a:stretch>
@@ -5482,7 +6021,7 @@
         </w:tc>
         <w:tc>
           <w:tcPr>
-            <w:tcW w:w="1254" w:type="dxa"/>
+            <w:tcW w:w="1008" w:type="dxa"/>
           </w:tcPr>
           <w:p/>
         </w:tc>
@@ -5490,18 +6029,17 @@
       <w:tr>
         <w:tc>
           <w:tcPr>
-            <w:tcW w:w="812" w:type="dxa"/>
-          </w:tcPr>
-          <w:p>
-            <w:r>
-              <w:lastRenderedPageBreak/>
+            <w:tcW w:w="852" w:type="dxa"/>
+          </w:tcPr>
+          <w:p>
+            <w:r>
               <w:t>TID3</w:t>
             </w:r>
           </w:p>
         </w:tc>
         <w:tc>
           <w:tcPr>
-            <w:tcW w:w="1206" w:type="dxa"/>
+            <w:tcW w:w="972" w:type="dxa"/>
           </w:tcPr>
           <w:p>
             <w:r>
@@ -5511,7 +6049,7 @@
         </w:tc>
         <w:tc>
           <w:tcPr>
-            <w:tcW w:w="673" w:type="dxa"/>
+            <w:tcW w:w="684" w:type="dxa"/>
           </w:tcPr>
           <w:p>
             <w:r>
@@ -5521,7 +6059,7 @@
         </w:tc>
         <w:tc>
           <w:tcPr>
-            <w:tcW w:w="699" w:type="dxa"/>
+            <w:tcW w:w="585" w:type="dxa"/>
           </w:tcPr>
           <w:p>
             <w:r>
@@ -5531,7 +6069,7 @@
         </w:tc>
         <w:tc>
           <w:tcPr>
-            <w:tcW w:w="1206" w:type="dxa"/>
+            <w:tcW w:w="972" w:type="dxa"/>
           </w:tcPr>
           <w:p>
             <w:r>
@@ -5541,7 +6079,7 @@
         </w:tc>
         <w:tc>
           <w:tcPr>
-            <w:tcW w:w="3166" w:type="dxa"/>
+            <w:tcW w:w="3943" w:type="dxa"/>
           </w:tcPr>
           <w:p>
             <w:r>
@@ -5564,7 +6102,7 @@
                           <pic:cNvPicPr/>
                         </pic:nvPicPr>
                         <pic:blipFill>
-                          <a:blip r:embed="rId65"/>
+                          <a:blip r:embed="rId72"/>
                           <a:stretch>
                             <a:fillRect/>
                           </a:stretch>
@@ -5588,7 +6126,7 @@
         </w:tc>
         <w:tc>
           <w:tcPr>
-            <w:tcW w:w="1254" w:type="dxa"/>
+            <w:tcW w:w="1008" w:type="dxa"/>
           </w:tcPr>
           <w:p/>
         </w:tc>
@@ -5596,7 +6134,7 @@
       <w:tr>
         <w:tc>
           <w:tcPr>
-            <w:tcW w:w="812" w:type="dxa"/>
+            <w:tcW w:w="852" w:type="dxa"/>
           </w:tcPr>
           <w:p>
             <w:r>
@@ -5606,7 +6144,7 @@
         </w:tc>
         <w:tc>
           <w:tcPr>
-            <w:tcW w:w="1206" w:type="dxa"/>
+            <w:tcW w:w="972" w:type="dxa"/>
           </w:tcPr>
           <w:p>
             <w:r>
@@ -5616,7 +6154,7 @@
         </w:tc>
         <w:tc>
           <w:tcPr>
-            <w:tcW w:w="673" w:type="dxa"/>
+            <w:tcW w:w="684" w:type="dxa"/>
           </w:tcPr>
           <w:p>
             <w:r>
@@ -5626,7 +6164,7 @@
         </w:tc>
         <w:tc>
           <w:tcPr>
-            <w:tcW w:w="699" w:type="dxa"/>
+            <w:tcW w:w="585" w:type="dxa"/>
           </w:tcPr>
           <w:p>
             <w:r>
@@ -5636,7 +6174,7 @@
         </w:tc>
         <w:tc>
           <w:tcPr>
-            <w:tcW w:w="1206" w:type="dxa"/>
+            <w:tcW w:w="972" w:type="dxa"/>
           </w:tcPr>
           <w:p>
             <w:r>
@@ -5646,7 +6184,7 @@
         </w:tc>
         <w:tc>
           <w:tcPr>
-            <w:tcW w:w="3166" w:type="dxa"/>
+            <w:tcW w:w="3943" w:type="dxa"/>
           </w:tcPr>
           <w:p>
             <w:r>
@@ -5656,7 +6194,7 @@
         </w:tc>
         <w:tc>
           <w:tcPr>
-            <w:tcW w:w="1254" w:type="dxa"/>
+            <w:tcW w:w="1008" w:type="dxa"/>
           </w:tcPr>
           <w:p/>
         </w:tc>
@@ -5664,7 +6202,7 @@
       <w:tr>
         <w:tc>
           <w:tcPr>
-            <w:tcW w:w="812" w:type="dxa"/>
+            <w:tcW w:w="852" w:type="dxa"/>
           </w:tcPr>
           <w:p>
             <w:r>
@@ -5674,7 +6212,7 @@
         </w:tc>
         <w:tc>
           <w:tcPr>
-            <w:tcW w:w="1206" w:type="dxa"/>
+            <w:tcW w:w="972" w:type="dxa"/>
           </w:tcPr>
           <w:p>
             <w:r>
@@ -5687,7 +6225,7 @@
         </w:tc>
         <w:tc>
           <w:tcPr>
-            <w:tcW w:w="673" w:type="dxa"/>
+            <w:tcW w:w="684" w:type="dxa"/>
           </w:tcPr>
           <w:p>
             <w:r>
@@ -5697,7 +6235,7 @@
         </w:tc>
         <w:tc>
           <w:tcPr>
-            <w:tcW w:w="699" w:type="dxa"/>
+            <w:tcW w:w="585" w:type="dxa"/>
           </w:tcPr>
           <w:p>
             <w:r>
@@ -5707,7 +6245,7 @@
         </w:tc>
         <w:tc>
           <w:tcPr>
-            <w:tcW w:w="1206" w:type="dxa"/>
+            <w:tcW w:w="972" w:type="dxa"/>
           </w:tcPr>
           <w:p>
             <w:r>
@@ -5717,7 +6255,7 @@
         </w:tc>
         <w:tc>
           <w:tcPr>
-            <w:tcW w:w="3166" w:type="dxa"/>
+            <w:tcW w:w="3943" w:type="dxa"/>
           </w:tcPr>
           <w:p>
             <w:r>
@@ -5727,7 +6265,7 @@
         </w:tc>
         <w:tc>
           <w:tcPr>
-            <w:tcW w:w="1254" w:type="dxa"/>
+            <w:tcW w:w="1008" w:type="dxa"/>
           </w:tcPr>
           <w:p/>
         </w:tc>
@@ -5735,7 +6273,7 @@
       <w:tr>
         <w:tc>
           <w:tcPr>
-            <w:tcW w:w="812" w:type="dxa"/>
+            <w:tcW w:w="852" w:type="dxa"/>
           </w:tcPr>
           <w:p>
             <w:r>
@@ -5750,7 +6288,7 @@
         </w:tc>
         <w:tc>
           <w:tcPr>
-            <w:tcW w:w="1206" w:type="dxa"/>
+            <w:tcW w:w="972" w:type="dxa"/>
           </w:tcPr>
           <w:p>
             <w:r>
@@ -5763,7 +6301,7 @@
         </w:tc>
         <w:tc>
           <w:tcPr>
-            <w:tcW w:w="673" w:type="dxa"/>
+            <w:tcW w:w="684" w:type="dxa"/>
           </w:tcPr>
           <w:p>
             <w:r>
@@ -5773,7 +6311,7 @@
         </w:tc>
         <w:tc>
           <w:tcPr>
-            <w:tcW w:w="699" w:type="dxa"/>
+            <w:tcW w:w="585" w:type="dxa"/>
           </w:tcPr>
           <w:p>
             <w:r>
@@ -5783,7 +6321,7 @@
         </w:tc>
         <w:tc>
           <w:tcPr>
-            <w:tcW w:w="1206" w:type="dxa"/>
+            <w:tcW w:w="972" w:type="dxa"/>
           </w:tcPr>
           <w:p>
             <w:r>
@@ -5793,7 +6331,7 @@
         </w:tc>
         <w:tc>
           <w:tcPr>
-            <w:tcW w:w="3166" w:type="dxa"/>
+            <w:tcW w:w="3943" w:type="dxa"/>
           </w:tcPr>
           <w:p>
             <w:r>
@@ -5816,7 +6354,7 @@
                           <pic:cNvPicPr/>
                         </pic:nvPicPr>
                         <pic:blipFill>
-                          <a:blip r:embed="rId66"/>
+                          <a:blip r:embed="rId73"/>
                           <a:stretch>
                             <a:fillRect/>
                           </a:stretch>
@@ -5840,7 +6378,7 @@
         </w:tc>
         <w:tc>
           <w:tcPr>
-            <w:tcW w:w="1254" w:type="dxa"/>
+            <w:tcW w:w="1008" w:type="dxa"/>
           </w:tcPr>
           <w:p/>
         </w:tc>
@@ -5848,7 +6386,7 @@
       <w:tr>
         <w:tc>
           <w:tcPr>
-            <w:tcW w:w="812" w:type="dxa"/>
+            <w:tcW w:w="852" w:type="dxa"/>
           </w:tcPr>
           <w:p>
             <w:r>
@@ -5863,7 +6401,7 @@
         </w:tc>
         <w:tc>
           <w:tcPr>
-            <w:tcW w:w="1206" w:type="dxa"/>
+            <w:tcW w:w="972" w:type="dxa"/>
           </w:tcPr>
           <w:p>
             <w:r>
@@ -5873,28 +6411,23 @@
               <w:t xml:space="preserve">the </w:t>
             </w:r>
             <w:r>
-              <w:t>website display all 8 produc</w:t>
-            </w:r>
-            <w:r>
-              <w:lastRenderedPageBreak/>
-              <w:t>ts in the correct grid format</w:t>
-            </w:r>
-          </w:p>
-        </w:tc>
-        <w:tc>
-          <w:tcPr>
-            <w:tcW w:w="673" w:type="dxa"/>
-          </w:tcPr>
-          <w:p>
-            <w:r>
-              <w:lastRenderedPageBreak/>
+              <w:t>website display all 8 products in the correct grid format</w:t>
+            </w:r>
+          </w:p>
+        </w:tc>
+        <w:tc>
+          <w:tcPr>
+            <w:tcW w:w="684" w:type="dxa"/>
+          </w:tcPr>
+          <w:p>
+            <w:r>
               <w:t>N/A</w:t>
             </w:r>
           </w:p>
         </w:tc>
         <w:tc>
           <w:tcPr>
-            <w:tcW w:w="699" w:type="dxa"/>
+            <w:tcW w:w="585" w:type="dxa"/>
           </w:tcPr>
           <w:p>
             <w:r>
@@ -5904,24 +6437,20 @@
         </w:tc>
         <w:tc>
           <w:tcPr>
-            <w:tcW w:w="1206" w:type="dxa"/>
+            <w:tcW w:w="972" w:type="dxa"/>
           </w:tcPr>
           <w:p>
             <w:r>
               <w:t>Each product displayed in its grid slot</w:t>
             </w:r>
             <w:r>
-              <w:t xml:space="preserve"> </w:t>
-            </w:r>
-            <w:r>
-              <w:lastRenderedPageBreak/>
-              <w:t>with the relevant info.</w:t>
-            </w:r>
-          </w:p>
-        </w:tc>
-        <w:tc>
-          <w:tcPr>
-            <w:tcW w:w="3166" w:type="dxa"/>
+              <w:t xml:space="preserve"> with the relevant info.</w:t>
+            </w:r>
+          </w:p>
+        </w:tc>
+        <w:tc>
+          <w:tcPr>
+            <w:tcW w:w="3943" w:type="dxa"/>
           </w:tcPr>
           <w:p>
             <w:pPr>
@@ -5933,7 +6462,6 @@
               <w:rPr>
                 <w:noProof/>
               </w:rPr>
-              <w:lastRenderedPageBreak/>
               <w:drawing>
                 <wp:inline distT="0" distB="0" distL="0" distR="0" wp14:anchorId="474B01B0" wp14:editId="02B49E85">
                   <wp:extent cx="1925054" cy="1164929"/>
@@ -5950,7 +6478,7 @@
                           <pic:cNvPicPr/>
                         </pic:nvPicPr>
                         <pic:blipFill>
-                          <a:blip r:embed="rId67"/>
+                          <a:blip r:embed="rId74"/>
                           <a:stretch>
                             <a:fillRect/>
                           </a:stretch>
@@ -5974,7 +6502,7 @@
         </w:tc>
         <w:tc>
           <w:tcPr>
-            <w:tcW w:w="1254" w:type="dxa"/>
+            <w:tcW w:w="1008" w:type="dxa"/>
           </w:tcPr>
           <w:p/>
         </w:tc>
@@ -5982,7 +6510,7 @@
       <w:tr>
         <w:tc>
           <w:tcPr>
-            <w:tcW w:w="812" w:type="dxa"/>
+            <w:tcW w:w="852" w:type="dxa"/>
           </w:tcPr>
           <w:p>
             <w:r>
@@ -5991,33 +6519,40 @@
           </w:p>
           <w:p>
             <w:r>
+              <w:lastRenderedPageBreak/>
               <w:t>27/10/26</w:t>
             </w:r>
           </w:p>
         </w:tc>
         <w:tc>
           <w:tcPr>
-            <w:tcW w:w="1206" w:type="dxa"/>
-          </w:tcPr>
-          <w:p>
-            <w:r>
-              <w:t>Does the sorting algorithms work</w:t>
-            </w:r>
-          </w:p>
-        </w:tc>
-        <w:tc>
-          <w:tcPr>
-            <w:tcW w:w="673" w:type="dxa"/>
-          </w:tcPr>
-          <w:p>
-            <w:r>
+            <w:tcW w:w="972" w:type="dxa"/>
+          </w:tcPr>
+          <w:p>
+            <w:r>
+              <w:lastRenderedPageBreak/>
+              <w:t xml:space="preserve">Does the </w:t>
+            </w:r>
+            <w:r>
+              <w:lastRenderedPageBreak/>
+              <w:t>sorting algorithms work</w:t>
+            </w:r>
+          </w:p>
+        </w:tc>
+        <w:tc>
+          <w:tcPr>
+            <w:tcW w:w="684" w:type="dxa"/>
+          </w:tcPr>
+          <w:p>
+            <w:r>
+              <w:lastRenderedPageBreak/>
               <w:t>N/A</w:t>
             </w:r>
           </w:p>
         </w:tc>
         <w:tc>
           <w:tcPr>
-            <w:tcW w:w="699" w:type="dxa"/>
+            <w:tcW w:w="585" w:type="dxa"/>
           </w:tcPr>
           <w:p>
             <w:r>
@@ -6027,17 +6562,21 @@
         </w:tc>
         <w:tc>
           <w:tcPr>
-            <w:tcW w:w="1206" w:type="dxa"/>
-          </w:tcPr>
-          <w:p>
-            <w:r>
-              <w:t>Yes all 6 of the sorting algorithms work.</w:t>
-            </w:r>
-          </w:p>
-        </w:tc>
-        <w:tc>
-          <w:tcPr>
-            <w:tcW w:w="3166" w:type="dxa"/>
+            <w:tcW w:w="972" w:type="dxa"/>
+          </w:tcPr>
+          <w:p>
+            <w:r>
+              <w:t xml:space="preserve">Yes all 6 of the </w:t>
+            </w:r>
+            <w:r>
+              <w:lastRenderedPageBreak/>
+              <w:t>sorting algorithms work.</w:t>
+            </w:r>
+          </w:p>
+        </w:tc>
+        <w:tc>
+          <w:tcPr>
+            <w:tcW w:w="3943" w:type="dxa"/>
           </w:tcPr>
           <w:p>
             <w:pPr>
@@ -6049,7 +6588,7 @@
         </w:tc>
         <w:tc>
           <w:tcPr>
-            <w:tcW w:w="1254" w:type="dxa"/>
+            <w:tcW w:w="1008" w:type="dxa"/>
           </w:tcPr>
           <w:p/>
         </w:tc>
@@ -6057,7 +6596,7 @@
       <w:tr>
         <w:tc>
           <w:tcPr>
-            <w:tcW w:w="812" w:type="dxa"/>
+            <w:tcW w:w="852" w:type="dxa"/>
           </w:tcPr>
           <w:p>
             <w:r>
@@ -6072,7 +6611,7 @@
         </w:tc>
         <w:tc>
           <w:tcPr>
-            <w:tcW w:w="1206" w:type="dxa"/>
+            <w:tcW w:w="972" w:type="dxa"/>
           </w:tcPr>
           <w:p>
             <w:r>
@@ -6085,7 +6624,7 @@
         </w:tc>
         <w:tc>
           <w:tcPr>
-            <w:tcW w:w="673" w:type="dxa"/>
+            <w:tcW w:w="684" w:type="dxa"/>
           </w:tcPr>
           <w:p>
             <w:r>
@@ -6095,7 +6634,7 @@
         </w:tc>
         <w:tc>
           <w:tcPr>
-            <w:tcW w:w="699" w:type="dxa"/>
+            <w:tcW w:w="585" w:type="dxa"/>
           </w:tcPr>
           <w:p>
             <w:r>
@@ -6105,7 +6644,7 @@
         </w:tc>
         <w:tc>
           <w:tcPr>
-            <w:tcW w:w="1206" w:type="dxa"/>
+            <w:tcW w:w="972" w:type="dxa"/>
           </w:tcPr>
           <w:p>
             <w:r>
@@ -6115,7 +6654,7 @@
         </w:tc>
         <w:tc>
           <w:tcPr>
-            <w:tcW w:w="3166" w:type="dxa"/>
+            <w:tcW w:w="3943" w:type="dxa"/>
           </w:tcPr>
           <w:p>
             <w:pPr>
@@ -6127,7 +6666,7 @@
         </w:tc>
         <w:tc>
           <w:tcPr>
-            <w:tcW w:w="1254" w:type="dxa"/>
+            <w:tcW w:w="1008" w:type="dxa"/>
           </w:tcPr>
           <w:p>
             <w:r>
@@ -6145,7 +6684,7 @@
       <w:tr>
         <w:tc>
           <w:tcPr>
-            <w:tcW w:w="812" w:type="dxa"/>
+            <w:tcW w:w="852" w:type="dxa"/>
           </w:tcPr>
           <w:p>
             <w:r>
@@ -6155,19 +6694,13 @@
           <w:p/>
           <w:p>
             <w:r>
-              <w:t>2</w:t>
-            </w:r>
-            <w:r>
-              <w:t>7</w:t>
-            </w:r>
-            <w:r>
-              <w:t>/10/26</w:t>
-            </w:r>
-          </w:p>
-        </w:tc>
-        <w:tc>
-          <w:tcPr>
-            <w:tcW w:w="1206" w:type="dxa"/>
+              <w:t>27/10/26</w:t>
+            </w:r>
+          </w:p>
+        </w:tc>
+        <w:tc>
+          <w:tcPr>
+            <w:tcW w:w="972" w:type="dxa"/>
           </w:tcPr>
           <w:p>
             <w:r>
@@ -6180,7 +6713,7 @@
         </w:tc>
         <w:tc>
           <w:tcPr>
-            <w:tcW w:w="673" w:type="dxa"/>
+            <w:tcW w:w="684" w:type="dxa"/>
           </w:tcPr>
           <w:p>
             <w:r>
@@ -6190,7 +6723,7 @@
         </w:tc>
         <w:tc>
           <w:tcPr>
-            <w:tcW w:w="699" w:type="dxa"/>
+            <w:tcW w:w="585" w:type="dxa"/>
           </w:tcPr>
           <w:p>
             <w:r>
@@ -6200,7 +6733,7 @@
         </w:tc>
         <w:tc>
           <w:tcPr>
-            <w:tcW w:w="1206" w:type="dxa"/>
+            <w:tcW w:w="972" w:type="dxa"/>
           </w:tcPr>
           <w:p>
             <w:r>
@@ -6210,7 +6743,7 @@
         </w:tc>
         <w:tc>
           <w:tcPr>
-            <w:tcW w:w="3166" w:type="dxa"/>
+            <w:tcW w:w="3943" w:type="dxa"/>
           </w:tcPr>
           <w:p>
             <w:pPr>
@@ -6238,7 +6771,7 @@
                           <pic:cNvPicPr/>
                         </pic:nvPicPr>
                         <pic:blipFill>
-                          <a:blip r:embed="rId68"/>
+                          <a:blip r:embed="rId75"/>
                           <a:stretch>
                             <a:fillRect/>
                           </a:stretch>
@@ -6262,7 +6795,7 @@
         </w:tc>
         <w:tc>
           <w:tcPr>
-            <w:tcW w:w="1254" w:type="dxa"/>
+            <w:tcW w:w="1008" w:type="dxa"/>
           </w:tcPr>
           <w:p/>
         </w:tc>
@@ -6270,7 +6803,7 @@
       <w:tr>
         <w:tc>
           <w:tcPr>
-            <w:tcW w:w="812" w:type="dxa"/>
+            <w:tcW w:w="852" w:type="dxa"/>
           </w:tcPr>
           <w:p>
             <w:r>
@@ -6286,7 +6819,7 @@
         </w:tc>
         <w:tc>
           <w:tcPr>
-            <w:tcW w:w="1206" w:type="dxa"/>
+            <w:tcW w:w="972" w:type="dxa"/>
           </w:tcPr>
           <w:p>
             <w:r>
@@ -6302,7 +6835,7 @@
         </w:tc>
         <w:tc>
           <w:tcPr>
-            <w:tcW w:w="673" w:type="dxa"/>
+            <w:tcW w:w="684" w:type="dxa"/>
           </w:tcPr>
           <w:p>
             <w:r>
@@ -6312,7 +6845,7 @@
         </w:tc>
         <w:tc>
           <w:tcPr>
-            <w:tcW w:w="699" w:type="dxa"/>
+            <w:tcW w:w="585" w:type="dxa"/>
           </w:tcPr>
           <w:p>
             <w:r>
@@ -6322,7 +6855,7 @@
         </w:tc>
         <w:tc>
           <w:tcPr>
-            <w:tcW w:w="1206" w:type="dxa"/>
+            <w:tcW w:w="972" w:type="dxa"/>
           </w:tcPr>
           <w:p>
             <w:r>
@@ -6332,7 +6865,7 @@
         </w:tc>
         <w:tc>
           <w:tcPr>
-            <w:tcW w:w="3166" w:type="dxa"/>
+            <w:tcW w:w="3943" w:type="dxa"/>
           </w:tcPr>
           <w:p>
             <w:pPr>
@@ -6360,7 +6893,7 @@
                           <pic:cNvPicPr/>
                         </pic:nvPicPr>
                         <pic:blipFill>
-                          <a:blip r:embed="rId69"/>
+                          <a:blip r:embed="rId76"/>
                           <a:stretch>
                             <a:fillRect/>
                           </a:stretch>
@@ -6392,9 +6925,9 @@
                 <w:noProof/>
               </w:rPr>
               <w:drawing>
-                <wp:inline distT="0" distB="0" distL="0" distR="0" wp14:anchorId="454A6AF8" wp14:editId="52F67885">
-                  <wp:extent cx="3458058" cy="1124107"/>
-                  <wp:effectExtent l="0" t="0" r="9525" b="0"/>
+                <wp:inline distT="0" distB="0" distL="0" distR="0" wp14:anchorId="454A6AF8" wp14:editId="0A3058B3">
+                  <wp:extent cx="1790055" cy="581891"/>
+                  <wp:effectExtent l="0" t="0" r="1270" b="8890"/>
                   <wp:docPr id="1613562308" name="Picture 1"/>
                   <wp:cNvGraphicFramePr>
                     <a:graphicFrameLocks xmlns:a="http://schemas.openxmlformats.org/drawingml/2006/main" noChangeAspect="1"/>
@@ -6407,7 +6940,7 @@
                           <pic:cNvPicPr/>
                         </pic:nvPicPr>
                         <pic:blipFill>
-                          <a:blip r:embed="rId70"/>
+                          <a:blip r:embed="rId77"/>
                           <a:stretch>
                             <a:fillRect/>
                           </a:stretch>
@@ -6415,7 +6948,7 @@
                         <pic:spPr>
                           <a:xfrm>
                             <a:off x="0" y="0"/>
-                            <a:ext cx="3458058" cy="1124107"/>
+                            <a:ext cx="1821753" cy="592195"/>
                           </a:xfrm>
                           <a:prstGeom prst="rect">
                             <a:avLst/>
@@ -6431,7 +6964,7 @@
         </w:tc>
         <w:tc>
           <w:tcPr>
-            <w:tcW w:w="1254" w:type="dxa"/>
+            <w:tcW w:w="1008" w:type="dxa"/>
           </w:tcPr>
           <w:p>
             <w:r>
@@ -6439,6 +6972,131 @@
             </w:r>
             <w:r>
               <w:t>json dictionary in the outputted array.</w:t>
+            </w:r>
+          </w:p>
+        </w:tc>
+      </w:tr>
+      <w:tr>
+        <w:tc>
+          <w:tcPr>
+            <w:tcW w:w="852" w:type="dxa"/>
+          </w:tcPr>
+          <w:p>
+            <w:r>
+              <w:t>TID11</w:t>
+            </w:r>
+          </w:p>
+          <w:p>
+            <w:r>
+              <w:t>28/10/26</w:t>
+            </w:r>
+          </w:p>
+        </w:tc>
+        <w:tc>
+          <w:tcPr>
+            <w:tcW w:w="972" w:type="dxa"/>
+          </w:tcPr>
+          <w:p>
+            <w:r>
+              <w:t>Does the total price update under the cart</w:t>
+            </w:r>
+          </w:p>
+        </w:tc>
+        <w:tc>
+          <w:tcPr>
+            <w:tcW w:w="684" w:type="dxa"/>
+          </w:tcPr>
+          <w:p>
+            <w:r>
+              <w:t>Clicks of different add to cart buttons</w:t>
+            </w:r>
+          </w:p>
+        </w:tc>
+        <w:tc>
+          <w:tcPr>
+            <w:tcW w:w="585" w:type="dxa"/>
+          </w:tcPr>
+          <w:p>
+            <w:r>
+              <w:t>Input + unit test</w:t>
+            </w:r>
+          </w:p>
+        </w:tc>
+        <w:tc>
+          <w:tcPr>
+            <w:tcW w:w="972" w:type="dxa"/>
+          </w:tcPr>
+          <w:p>
+            <w:r>
+              <w:t xml:space="preserve">Yes the </w:t>
+            </w:r>
+            <w:r>
+              <w:t>total price does fully update successfully and accurately</w:t>
+            </w:r>
+          </w:p>
+        </w:tc>
+        <w:tc>
+          <w:tcPr>
+            <w:tcW w:w="3943" w:type="dxa"/>
+          </w:tcPr>
+          <w:p>
+            <w:pPr>
+              <w:rPr>
+                <w:noProof/>
+              </w:rPr>
+            </w:pPr>
+            <w:r>
+              <w:rPr>
+                <w:noProof/>
+              </w:rPr>
+              <w:drawing>
+                <wp:inline distT="0" distB="0" distL="0" distR="0" wp14:anchorId="7D7B51A7" wp14:editId="5AADC9BC">
+                  <wp:extent cx="1602157" cy="1163782"/>
+                  <wp:effectExtent l="0" t="0" r="0" b="0"/>
+                  <wp:docPr id="1852089469" name="Picture 1"/>
+                  <wp:cNvGraphicFramePr>
+                    <a:graphicFrameLocks xmlns:a="http://schemas.openxmlformats.org/drawingml/2006/main" noChangeAspect="1"/>
+                  </wp:cNvGraphicFramePr>
+                  <a:graphic xmlns:a="http://schemas.openxmlformats.org/drawingml/2006/main">
+                    <a:graphicData uri="http://schemas.openxmlformats.org/drawingml/2006/picture">
+                      <pic:pic xmlns:pic="http://schemas.openxmlformats.org/drawingml/2006/picture">
+                        <pic:nvPicPr>
+                          <pic:cNvPr id="1852089469" name=""/>
+                          <pic:cNvPicPr/>
+                        </pic:nvPicPr>
+                        <pic:blipFill>
+                          <a:blip r:embed="rId78"/>
+                          <a:stretch>
+                            <a:fillRect/>
+                          </a:stretch>
+                        </pic:blipFill>
+                        <pic:spPr>
+                          <a:xfrm>
+                            <a:off x="0" y="0"/>
+                            <a:ext cx="1609739" cy="1169289"/>
+                          </a:xfrm>
+                          <a:prstGeom prst="rect">
+                            <a:avLst/>
+                          </a:prstGeom>
+                        </pic:spPr>
+                      </pic:pic>
+                    </a:graphicData>
+                  </a:graphic>
+                </wp:inline>
+              </w:drawing>
+            </w:r>
+          </w:p>
+        </w:tc>
+        <w:tc>
+          <w:tcPr>
+            <w:tcW w:w="1008" w:type="dxa"/>
+          </w:tcPr>
+          <w:p>
+            <w:r>
+              <w:t xml:space="preserve">The next change will be adding the individual pricing to the </w:t>
+            </w:r>
+            <w:r>
+              <w:t>list items.</w:t>
             </w:r>
           </w:p>
         </w:tc>
@@ -6542,7 +7200,7 @@
             <w:tcW w:w="2254" w:type="dxa"/>
           </w:tcPr>
           <w:p>
-            <w:hyperlink r:id="rId71" w:history="1">
+            <w:hyperlink r:id="rId79" w:history="1">
               <w:r>
                 <w:rPr>
                   <w:rStyle w:val="Hyperlink"/>
@@ -6600,7 +7258,7 @@
             <w:tcW w:w="2254" w:type="dxa"/>
           </w:tcPr>
           <w:p>
-            <w:hyperlink r:id="rId72" w:history="1">
+            <w:hyperlink r:id="rId80" w:history="1">
               <w:r>
                 <w:rPr>
                   <w:rStyle w:val="Hyperlink"/>
@@ -6708,7 +7366,7 @@
             <w:r>
               <w:br/>
             </w:r>
-            <w:hyperlink r:id="rId73" w:history="1">
+            <w:hyperlink r:id="rId81" w:history="1">
               <w:r>
                 <w:rPr>
                   <w:rStyle w:val="Hyperlink"/>
@@ -7347,6 +8005,7 @@
   <w:style w:type="character" w:default="1" w:styleId="DefaultParagraphFont">
     <w:name w:val="Default Paragraph Font"/>
     <w:uiPriority w:val="1"/>
+    <w:semiHidden/>
     <w:unhideWhenUsed/>
   </w:style>
   <w:style w:type="table" w:default="1" w:styleId="TableNormal">

</xml_diff>

<commit_message>
Stage 6 - Caught up on commenting
</commit_message>
<xml_diff>
--- a/JM - Shop Documentation.docx
+++ b/JM - Shop Documentation.docx
@@ -114,9 +114,13 @@
           </w:p>
           <w:p/>
           <w:p>
+            <w:proofErr w:type="spellStart"/>
+            <w:proofErr w:type="gramStart"/>
             <w:r>
               <w:t>products.json</w:t>
             </w:r>
+            <w:proofErr w:type="spellEnd"/>
+            <w:proofErr w:type="gramEnd"/>
           </w:p>
         </w:tc>
         <w:tc>
@@ -211,7 +215,23 @@
               <w:t xml:space="preserve">Started the </w:t>
             </w:r>
             <w:r>
-              <w:t xml:space="preserve">index html, set the name, linked the javascript + css and </w:t>
+              <w:t xml:space="preserve">index html, set the name, linked the </w:t>
+            </w:r>
+            <w:proofErr w:type="spellStart"/>
+            <w:r>
+              <w:t>javascript</w:t>
+            </w:r>
+            <w:proofErr w:type="spellEnd"/>
+            <w:r>
+              <w:t xml:space="preserve"> + </w:t>
+            </w:r>
+            <w:proofErr w:type="spellStart"/>
+            <w:r>
+              <w:t>css</w:t>
+            </w:r>
+            <w:proofErr w:type="spellEnd"/>
+            <w:r>
+              <w:t xml:space="preserve"> and </w:t>
             </w:r>
             <w:r>
               <w:t>set the title.</w:t>
@@ -659,7 +679,15 @@
               <w:t xml:space="preserve">Designed the </w:t>
             </w:r>
             <w:r>
-              <w:t>list item to store all the information and updated css to do so.</w:t>
+              <w:t xml:space="preserve">list item to store all the information and updated </w:t>
+            </w:r>
+            <w:proofErr w:type="spellStart"/>
+            <w:r>
+              <w:t>css</w:t>
+            </w:r>
+            <w:proofErr w:type="spellEnd"/>
+            <w:r>
+              <w:t xml:space="preserve"> to do so.</w:t>
             </w:r>
           </w:p>
         </w:tc>
@@ -828,7 +856,15 @@
               <w:t xml:space="preserve">Here I started </w:t>
             </w:r>
             <w:r>
-              <w:t>working on the javascript to fetch the array from the JSON.</w:t>
+              <w:t xml:space="preserve">working on the </w:t>
+            </w:r>
+            <w:proofErr w:type="spellStart"/>
+            <w:r>
+              <w:t>javascript</w:t>
+            </w:r>
+            <w:proofErr w:type="spellEnd"/>
+            <w:r>
+              <w:t xml:space="preserve"> to fetch the array from the JSON.</w:t>
             </w:r>
           </w:p>
         </w:tc>
@@ -1000,8 +1036,13 @@
             <w:r>
               <w:t xml:space="preserve">Here I added the </w:t>
             </w:r>
-            <w:r>
-              <w:t xml:space="preserve">‘.JSON()’ to the response from the fetch and changed the </w:t>
+            <w:proofErr w:type="gramStart"/>
+            <w:r>
+              <w:t>‘.JSON</w:t>
+            </w:r>
+            <w:proofErr w:type="gramEnd"/>
+            <w:r>
+              <w:t xml:space="preserve">()’ to the response from the fetch and changed the </w:t>
             </w:r>
             <w:r>
               <w:t>variable names to better suit their purpose.</w:t>
@@ -1230,7 +1271,15 @@
             </w:pPr>
             <w:r>
               <w:lastRenderedPageBreak/>
-              <w:t xml:space="preserve">Here I added an id to the unordered </w:t>
+              <w:t xml:space="preserve">Here I added an </w:t>
+            </w:r>
+            <w:proofErr w:type="spellStart"/>
+            <w:r>
+              <w:t>id</w:t>
+            </w:r>
+            <w:proofErr w:type="spellEnd"/>
+            <w:r>
+              <w:t xml:space="preserve"> to the unordered </w:t>
             </w:r>
             <w:r>
               <w:lastRenderedPageBreak/>
@@ -1379,7 +1428,15 @@
               <w:t xml:space="preserve">container, the </w:t>
             </w:r>
             <w:r>
-              <w:t>car name p tag would then get its text set and the appropriate appendages would take place</w:t>
+              <w:t xml:space="preserve">car name p tag would then get its text </w:t>
+            </w:r>
+            <w:proofErr w:type="gramStart"/>
+            <w:r>
+              <w:t>set</w:t>
+            </w:r>
+            <w:proofErr w:type="gramEnd"/>
+            <w:r>
+              <w:t xml:space="preserve"> and the appropriate appendages would take place</w:t>
             </w:r>
             <w:r>
               <w:t xml:space="preserve">. Every loop the program will log to the console as a </w:t>
@@ -2213,7 +2270,15 @@
               </w:tabs>
             </w:pPr>
             <w:r>
-              <w:t xml:space="preserve">During further development I realised using an li tag and then a div tag within that </w:t>
+              <w:t xml:space="preserve">During further development I realised using </w:t>
+            </w:r>
+            <w:proofErr w:type="gramStart"/>
+            <w:r>
+              <w:t>an</w:t>
+            </w:r>
+            <w:proofErr w:type="gramEnd"/>
+            <w:r>
+              <w:t xml:space="preserve"> li tag and then a div tag within that </w:t>
             </w:r>
             <w:r>
               <w:t xml:space="preserve">so that the </w:t>
@@ -2439,8 +2504,13 @@
             <w:r>
               <w:t xml:space="preserve">Here I updated and improved the </w:t>
             </w:r>
-            <w:r>
-              <w:t>css to build a better display for the products.</w:t>
+            <w:proofErr w:type="spellStart"/>
+            <w:r>
+              <w:t>css</w:t>
+            </w:r>
+            <w:proofErr w:type="spellEnd"/>
+            <w:r>
+              <w:t xml:space="preserve"> to build a better display for the products.</w:t>
             </w:r>
           </w:p>
         </w:tc>
@@ -2566,9 +2636,11 @@
           </w:p>
           <w:p/>
           <w:p>
+            <w:proofErr w:type="spellStart"/>
             <w:r>
               <w:t>Products.json</w:t>
             </w:r>
+            <w:proofErr w:type="spellEnd"/>
           </w:p>
           <w:p/>
           <w:p>
@@ -2588,7 +2660,15 @@
               </w:tabs>
             </w:pPr>
             <w:r>
-              <w:t xml:space="preserve">Now that the proof of concept is complete I have now moved on to </w:t>
+              <w:t xml:space="preserve">Now that the proof of concept is </w:t>
+            </w:r>
+            <w:proofErr w:type="gramStart"/>
+            <w:r>
+              <w:t>complete</w:t>
+            </w:r>
+            <w:proofErr w:type="gramEnd"/>
+            <w:r>
+              <w:t xml:space="preserve"> I have now moved on to </w:t>
             </w:r>
             <w:r>
               <w:t>starting to display this information</w:t>
@@ -3263,13 +3343,29 @@
           <w:p>
             <w:r>
               <w:lastRenderedPageBreak/>
-              <w:t xml:space="preserve">During the development of this version I noticed that there is no need for the </w:t>
+              <w:t xml:space="preserve">During the development of this </w:t>
+            </w:r>
+            <w:proofErr w:type="gramStart"/>
+            <w:r>
+              <w:t>version</w:t>
+            </w:r>
+            <w:proofErr w:type="gramEnd"/>
+            <w:r>
+              <w:t xml:space="preserve"> I noticed that there is no need for the </w:t>
             </w:r>
             <w:r>
               <w:t>over engineered grid location allocation</w:t>
             </w:r>
             <w:r>
-              <w:t xml:space="preserve"> and will do this automatically. Therefore the original code for this has been removed.</w:t>
+              <w:t xml:space="preserve"> and will do this automatically. </w:t>
+            </w:r>
+            <w:proofErr w:type="gramStart"/>
+            <w:r>
+              <w:t>Therefore</w:t>
+            </w:r>
+            <w:proofErr w:type="gramEnd"/>
+            <w:r>
+              <w:t xml:space="preserve"> the original code for this has been removed.</w:t>
             </w:r>
           </w:p>
         </w:tc>
@@ -3453,10 +3549,18 @@
               </w:tabs>
             </w:pPr>
             <w:r>
-              <w:t>Here I have started the java</w:t>
-            </w:r>
-            <w:r>
-              <w:t xml:space="preserve">script for the </w:t>
+              <w:t xml:space="preserve">Here I have started the </w:t>
+            </w:r>
+            <w:proofErr w:type="spellStart"/>
+            <w:r>
+              <w:t>java</w:t>
+            </w:r>
+            <w:r>
+              <w:t>script</w:t>
+            </w:r>
+            <w:proofErr w:type="spellEnd"/>
+            <w:r>
+              <w:t xml:space="preserve"> for the </w:t>
             </w:r>
             <w:r>
               <w:lastRenderedPageBreak/>
@@ -3473,7 +3577,15 @@
               <w:t xml:space="preserve">All that is left is figuring out how to </w:t>
             </w:r>
             <w:r>
-              <w:t>sort the items of the JSON file as there is many cases where FILTER.value does not work</w:t>
+              <w:t xml:space="preserve">sort the items of the JSON file as there is many cases where </w:t>
+            </w:r>
+            <w:proofErr w:type="spellStart"/>
+            <w:r>
+              <w:t>FILTER.value</w:t>
+            </w:r>
+            <w:proofErr w:type="spellEnd"/>
+            <w:r>
+              <w:t xml:space="preserve"> does not work</w:t>
             </w:r>
           </w:p>
         </w:tc>
@@ -3790,7 +3902,15 @@
               </w:tabs>
             </w:pPr>
             <w:r>
-              <w:t>Here I completed the suggestions made by copilot which then lead to the program working as expected.</w:t>
+              <w:t xml:space="preserve">Here I completed the suggestions made by copilot which then </w:t>
+            </w:r>
+            <w:proofErr w:type="gramStart"/>
+            <w:r>
+              <w:t>lead</w:t>
+            </w:r>
+            <w:proofErr w:type="gramEnd"/>
+            <w:r>
+              <w:t xml:space="preserve"> to the program working as expected.</w:t>
             </w:r>
           </w:p>
           <w:p>
@@ -4289,9 +4409,13 @@
             </w:r>
           </w:p>
           <w:p>
+            <w:proofErr w:type="spellStart"/>
+            <w:proofErr w:type="gramStart"/>
             <w:r>
               <w:t>products.json</w:t>
             </w:r>
+            <w:proofErr w:type="spellEnd"/>
+            <w:proofErr w:type="gramEnd"/>
           </w:p>
           <w:p/>
           <w:p>
@@ -4321,7 +4445,15 @@
               </w:tabs>
             </w:pPr>
             <w:r>
-              <w:t>I have added the alerts for testing and the .model within the push command for testing of the syntax</w:t>
+              <w:t xml:space="preserve">I have added the alerts for testing and </w:t>
+            </w:r>
+            <w:proofErr w:type="gramStart"/>
+            <w:r>
+              <w:t>the .model</w:t>
+            </w:r>
+            <w:proofErr w:type="gramEnd"/>
+            <w:r>
+              <w:t xml:space="preserve"> within the push command for testing of the syntax</w:t>
             </w:r>
           </w:p>
         </w:tc>
@@ -4484,7 +4616,15 @@
               <w:t>Here I added the updating to the cart ul tag using the for loop</w:t>
             </w:r>
             <w:r>
-              <w:t xml:space="preserve"> to iterate through all the items. Also I sorted the cart array by product ID so that it is more organised.</w:t>
+              <w:t xml:space="preserve"> to iterate through all the items. </w:t>
+            </w:r>
+            <w:proofErr w:type="gramStart"/>
+            <w:r>
+              <w:t>Also</w:t>
+            </w:r>
+            <w:proofErr w:type="gramEnd"/>
+            <w:r>
+              <w:t xml:space="preserve"> I sorted the cart array by product ID so that it is more organised.</w:t>
             </w:r>
           </w:p>
           <w:p>
@@ -4826,7 +4966,15 @@
               <w:t xml:space="preserve">Here I added the new </w:t>
             </w:r>
             <w:r>
-              <w:t>price label to the list of items in the users cart.</w:t>
+              <w:t xml:space="preserve">price label to the list of items in the </w:t>
+            </w:r>
+            <w:proofErr w:type="gramStart"/>
+            <w:r>
+              <w:t>users</w:t>
+            </w:r>
+            <w:proofErr w:type="gramEnd"/>
+            <w:r>
+              <w:t xml:space="preserve"> cart.</w:t>
             </w:r>
           </w:p>
         </w:tc>
@@ -5163,6 +5311,192 @@
           <w:p/>
         </w:tc>
       </w:tr>
+      <w:tr>
+        <w:tc>
+          <w:tcPr>
+            <w:tcW w:w="1366" w:type="dxa"/>
+          </w:tcPr>
+          <w:p>
+            <w:r>
+              <w:t>VID38</w:t>
+            </w:r>
+          </w:p>
+        </w:tc>
+        <w:tc>
+          <w:tcPr>
+            <w:tcW w:w="1308" w:type="dxa"/>
+          </w:tcPr>
+          <w:p>
+            <w:pPr>
+              <w:tabs>
+                <w:tab w:val="left" w:pos="837"/>
+              </w:tabs>
+            </w:pPr>
+            <w:r>
+              <w:t>Here I updated all files to be fully commented</w:t>
+            </w:r>
+          </w:p>
+        </w:tc>
+        <w:tc>
+          <w:tcPr>
+            <w:tcW w:w="4949" w:type="dxa"/>
+          </w:tcPr>
+          <w:p>
+            <w:pPr>
+              <w:rPr>
+                <w:noProof/>
+              </w:rPr>
+            </w:pPr>
+            <w:r>
+              <w:rPr>
+                <w:noProof/>
+              </w:rPr>
+              <w:drawing>
+                <wp:inline distT="0" distB="0" distL="0" distR="0" wp14:anchorId="7402B7C1" wp14:editId="0CE26806">
+                  <wp:extent cx="2852099" cy="2208811"/>
+                  <wp:effectExtent l="0" t="0" r="5715" b="1270"/>
+                  <wp:docPr id="608724545" name="Picture 1"/>
+                  <wp:cNvGraphicFramePr>
+                    <a:graphicFrameLocks xmlns:a="http://schemas.openxmlformats.org/drawingml/2006/main" noChangeAspect="1"/>
+                  </wp:cNvGraphicFramePr>
+                  <a:graphic xmlns:a="http://schemas.openxmlformats.org/drawingml/2006/main">
+                    <a:graphicData uri="http://schemas.openxmlformats.org/drawingml/2006/picture">
+                      <pic:pic xmlns:pic="http://schemas.openxmlformats.org/drawingml/2006/picture">
+                        <pic:nvPicPr>
+                          <pic:cNvPr id="608724545" name=""/>
+                          <pic:cNvPicPr/>
+                        </pic:nvPicPr>
+                        <pic:blipFill>
+                          <a:blip r:embed="rId69"/>
+                          <a:stretch>
+                            <a:fillRect/>
+                          </a:stretch>
+                        </pic:blipFill>
+                        <pic:spPr>
+                          <a:xfrm>
+                            <a:off x="0" y="0"/>
+                            <a:ext cx="2858228" cy="2213558"/>
+                          </a:xfrm>
+                          <a:prstGeom prst="rect">
+                            <a:avLst/>
+                          </a:prstGeom>
+                        </pic:spPr>
+                      </pic:pic>
+                    </a:graphicData>
+                  </a:graphic>
+                </wp:inline>
+              </w:drawing>
+            </w:r>
+          </w:p>
+          <w:p>
+            <w:pPr>
+              <w:rPr>
+                <w:noProof/>
+              </w:rPr>
+            </w:pPr>
+            <w:r>
+              <w:rPr>
+                <w:noProof/>
+              </w:rPr>
+              <w:drawing>
+                <wp:inline distT="0" distB="0" distL="0" distR="0" wp14:anchorId="36983AF8" wp14:editId="6A33B4F7">
+                  <wp:extent cx="2788970" cy="435432"/>
+                  <wp:effectExtent l="0" t="0" r="0" b="3175"/>
+                  <wp:docPr id="1470478888" name="Picture 1"/>
+                  <wp:cNvGraphicFramePr>
+                    <a:graphicFrameLocks xmlns:a="http://schemas.openxmlformats.org/drawingml/2006/main" noChangeAspect="1"/>
+                  </wp:cNvGraphicFramePr>
+                  <a:graphic xmlns:a="http://schemas.openxmlformats.org/drawingml/2006/main">
+                    <a:graphicData uri="http://schemas.openxmlformats.org/drawingml/2006/picture">
+                      <pic:pic xmlns:pic="http://schemas.openxmlformats.org/drawingml/2006/picture">
+                        <pic:nvPicPr>
+                          <pic:cNvPr id="1470478888" name=""/>
+                          <pic:cNvPicPr/>
+                        </pic:nvPicPr>
+                        <pic:blipFill>
+                          <a:blip r:embed="rId70"/>
+                          <a:stretch>
+                            <a:fillRect/>
+                          </a:stretch>
+                        </pic:blipFill>
+                        <pic:spPr>
+                          <a:xfrm>
+                            <a:off x="0" y="0"/>
+                            <a:ext cx="2842855" cy="443845"/>
+                          </a:xfrm>
+                          <a:prstGeom prst="rect">
+                            <a:avLst/>
+                          </a:prstGeom>
+                        </pic:spPr>
+                      </pic:pic>
+                    </a:graphicData>
+                  </a:graphic>
+                </wp:inline>
+              </w:drawing>
+            </w:r>
+          </w:p>
+          <w:p>
+            <w:pPr>
+              <w:rPr>
+                <w:noProof/>
+              </w:rPr>
+            </w:pPr>
+            <w:r>
+              <w:rPr>
+                <w:noProof/>
+              </w:rPr>
+              <w:drawing>
+                <wp:inline distT="0" distB="0" distL="0" distR="0" wp14:anchorId="795920B7" wp14:editId="0D45019A">
+                  <wp:extent cx="2815687" cy="424852"/>
+                  <wp:effectExtent l="0" t="0" r="3810" b="0"/>
+                  <wp:docPr id="45368746" name="Picture 1"/>
+                  <wp:cNvGraphicFramePr>
+                    <a:graphicFrameLocks xmlns:a="http://schemas.openxmlformats.org/drawingml/2006/main" noChangeAspect="1"/>
+                  </wp:cNvGraphicFramePr>
+                  <a:graphic xmlns:a="http://schemas.openxmlformats.org/drawingml/2006/main">
+                    <a:graphicData uri="http://schemas.openxmlformats.org/drawingml/2006/picture">
+                      <pic:pic xmlns:pic="http://schemas.openxmlformats.org/drawingml/2006/picture">
+                        <pic:nvPicPr>
+                          <pic:cNvPr id="45368746" name=""/>
+                          <pic:cNvPicPr/>
+                        </pic:nvPicPr>
+                        <pic:blipFill>
+                          <a:blip r:embed="rId71"/>
+                          <a:stretch>
+                            <a:fillRect/>
+                          </a:stretch>
+                        </pic:blipFill>
+                        <pic:spPr>
+                          <a:xfrm>
+                            <a:off x="0" y="0"/>
+                            <a:ext cx="2836453" cy="427985"/>
+                          </a:xfrm>
+                          <a:prstGeom prst="rect">
+                            <a:avLst/>
+                          </a:prstGeom>
+                        </pic:spPr>
+                      </pic:pic>
+                    </a:graphicData>
+                  </a:graphic>
+                </wp:inline>
+              </w:drawing>
+            </w:r>
+          </w:p>
+          <w:p>
+            <w:pPr>
+              <w:rPr>
+                <w:noProof/>
+              </w:rPr>
+            </w:pPr>
+          </w:p>
+        </w:tc>
+        <w:tc>
+          <w:tcPr>
+            <w:tcW w:w="1393" w:type="dxa"/>
+          </w:tcPr>
+          <w:p/>
+        </w:tc>
+      </w:tr>
     </w:tbl>
     <w:p/>
     <w:p>
@@ -5170,6 +5504,7 @@
         <w:pStyle w:val="Heading1"/>
       </w:pPr>
       <w:r>
+        <w:lastRenderedPageBreak/>
         <w:t>Test log</w:t>
       </w:r>
     </w:p>
@@ -5388,7 +5723,15 @@
               <w:t>The</w:t>
             </w:r>
             <w:r>
-              <w:t>re is no error but the log does not contain the array</w:t>
+              <w:t xml:space="preserve">re is no </w:t>
+            </w:r>
+            <w:proofErr w:type="gramStart"/>
+            <w:r>
+              <w:t>error</w:t>
+            </w:r>
+            <w:proofErr w:type="gramEnd"/>
+            <w:r>
+              <w:t xml:space="preserve"> but the log does not contain the array</w:t>
             </w:r>
           </w:p>
         </w:tc>
@@ -5406,7 +5749,6 @@
           </w:tcPr>
           <w:p>
             <w:r>
-              <w:lastRenderedPageBreak/>
               <w:t>TID1.2</w:t>
             </w:r>
           </w:p>
@@ -5682,6 +6024,7 @@
           </w:tcPr>
           <w:p>
             <w:r>
+              <w:lastRenderedPageBreak/>
               <w:t>TID2.3</w:t>
             </w:r>
           </w:p>
@@ -5751,7 +6094,7 @@
                           <pic:cNvPicPr/>
                         </pic:nvPicPr>
                         <pic:blipFill>
-                          <a:blip r:embed="rId69"/>
+                          <a:blip r:embed="rId72"/>
                           <a:stretch>
                             <a:fillRect/>
                           </a:stretch>
@@ -5867,7 +6210,7 @@
                           <pic:cNvPicPr/>
                         </pic:nvPicPr>
                         <pic:blipFill>
-                          <a:blip r:embed="rId70"/>
+                          <a:blip r:embed="rId73"/>
                           <a:stretch>
                             <a:fillRect/>
                           </a:stretch>
@@ -5918,11 +6261,7 @@
           </w:tcPr>
           <w:p>
             <w:r>
-              <w:t xml:space="preserve">Does the ul </w:t>
-            </w:r>
-            <w:r>
-              <w:lastRenderedPageBreak/>
-              <w:t>tag update and log the console</w:t>
+              <w:t>Does the ul tag update and log the console</w:t>
             </w:r>
           </w:p>
         </w:tc>
@@ -5932,7 +6271,6 @@
           </w:tcPr>
           <w:p>
             <w:r>
-              <w:lastRenderedPageBreak/>
               <w:t>N/A</w:t>
             </w:r>
           </w:p>
@@ -5953,11 +6291,7 @@
           </w:tcPr>
           <w:p>
             <w:r>
-              <w:t xml:space="preserve">Console logs the </w:t>
-            </w:r>
-            <w:r>
-              <w:lastRenderedPageBreak/>
-              <w:t>contents of the selected item of the array</w:t>
+              <w:t>Console logs the contents of the selected item of the array</w:t>
             </w:r>
           </w:p>
         </w:tc>
@@ -5967,12 +6301,7 @@
           </w:tcPr>
           <w:p>
             <w:r>
-              <w:lastRenderedPageBreak/>
-              <w:t xml:space="preserve">Console logs the contents of the selected </w:t>
-            </w:r>
-            <w:r>
-              <w:lastRenderedPageBreak/>
-              <w:t>item of the array</w:t>
+              <w:t>Console logs the contents of the selected item of the array</w:t>
             </w:r>
             <w:r>
               <w:t xml:space="preserve"> </w:t>
@@ -5997,7 +6326,7 @@
                           <pic:cNvPicPr/>
                         </pic:nvPicPr>
                         <pic:blipFill>
-                          <a:blip r:embed="rId71"/>
+                          <a:blip r:embed="rId74"/>
                           <a:stretch>
                             <a:fillRect/>
                           </a:stretch>
@@ -6102,7 +6431,7 @@
                           <pic:cNvPicPr/>
                         </pic:nvPicPr>
                         <pic:blipFill>
-                          <a:blip r:embed="rId72"/>
+                          <a:blip r:embed="rId75"/>
                           <a:stretch>
                             <a:fillRect/>
                           </a:stretch>
@@ -6277,6 +6606,7 @@
           </w:tcPr>
           <w:p>
             <w:r>
+              <w:lastRenderedPageBreak/>
               <w:t>TID5</w:t>
             </w:r>
           </w:p>
@@ -6354,7 +6684,7 @@
                           <pic:cNvPicPr/>
                         </pic:nvPicPr>
                         <pic:blipFill>
-                          <a:blip r:embed="rId73"/>
+                          <a:blip r:embed="rId76"/>
                           <a:stretch>
                             <a:fillRect/>
                           </a:stretch>
@@ -6478,7 +6808,7 @@
                           <pic:cNvPicPr/>
                         </pic:nvPicPr>
                         <pic:blipFill>
-                          <a:blip r:embed="rId74"/>
+                          <a:blip r:embed="rId77"/>
                           <a:stretch>
                             <a:fillRect/>
                           </a:stretch>
@@ -6519,7 +6849,6 @@
           </w:p>
           <w:p>
             <w:r>
-              <w:lastRenderedPageBreak/>
               <w:t>27/10/26</w:t>
             </w:r>
           </w:p>
@@ -6530,12 +6859,7 @@
           </w:tcPr>
           <w:p>
             <w:r>
-              <w:lastRenderedPageBreak/>
-              <w:t xml:space="preserve">Does the </w:t>
-            </w:r>
-            <w:r>
-              <w:lastRenderedPageBreak/>
-              <w:t>sorting algorithms work</w:t>
+              <w:t>Does the sorting algorithms work</w:t>
             </w:r>
           </w:p>
         </w:tc>
@@ -6545,7 +6869,6 @@
           </w:tcPr>
           <w:p>
             <w:r>
-              <w:lastRenderedPageBreak/>
               <w:t>N/A</w:t>
             </w:r>
           </w:p>
@@ -6565,12 +6888,13 @@
             <w:tcW w:w="972" w:type="dxa"/>
           </w:tcPr>
           <w:p>
-            <w:r>
-              <w:t xml:space="preserve">Yes all 6 of the </w:t>
-            </w:r>
-            <w:r>
-              <w:lastRenderedPageBreak/>
-              <w:t>sorting algorithms work.</w:t>
+            <w:proofErr w:type="gramStart"/>
+            <w:r>
+              <w:t>Yes</w:t>
+            </w:r>
+            <w:proofErr w:type="gramEnd"/>
+            <w:r>
+              <w:t xml:space="preserve"> all 6 of the sorting algorithms work.</w:t>
             </w:r>
           </w:p>
         </w:tc>
@@ -6647,8 +6971,21 @@
             <w:tcW w:w="972" w:type="dxa"/>
           </w:tcPr>
           <w:p>
-            <w:r>
-              <w:t>No the alerts show but the grid is not populate again</w:t>
+            <w:proofErr w:type="gramStart"/>
+            <w:r>
+              <w:t>No</w:t>
+            </w:r>
+            <w:proofErr w:type="gramEnd"/>
+            <w:r>
+              <w:t xml:space="preserve"> the alerts show but the grid is not </w:t>
+            </w:r>
+            <w:proofErr w:type="gramStart"/>
+            <w:r>
+              <w:t>populate</w:t>
+            </w:r>
+            <w:proofErr w:type="gramEnd"/>
+            <w:r>
+              <w:t xml:space="preserve"> again</w:t>
             </w:r>
           </w:p>
         </w:tc>
@@ -6736,8 +7073,13 @@
             <w:tcW w:w="972" w:type="dxa"/>
           </w:tcPr>
           <w:p>
-            <w:r>
-              <w:t>Yes the dropdown does sort the products as intended</w:t>
+            <w:proofErr w:type="gramStart"/>
+            <w:r>
+              <w:t>Yes</w:t>
+            </w:r>
+            <w:proofErr w:type="gramEnd"/>
+            <w:r>
+              <w:t xml:space="preserve"> the dropdown does sort the products as intended</w:t>
             </w:r>
           </w:p>
         </w:tc>
@@ -6771,7 +7113,7 @@
                           <pic:cNvPicPr/>
                         </pic:nvPicPr>
                         <pic:blipFill>
-                          <a:blip r:embed="rId75"/>
+                          <a:blip r:embed="rId78"/>
                           <a:stretch>
                             <a:fillRect/>
                           </a:stretch>
@@ -6829,6 +7171,7 @@
               <w:t xml:space="preserve">correct product id display in the alert along with an array of </w:t>
             </w:r>
             <w:r>
+              <w:lastRenderedPageBreak/>
               <w:t>car names</w:t>
             </w:r>
           </w:p>
@@ -6839,6 +7182,7 @@
           </w:tcPr>
           <w:p>
             <w:r>
+              <w:lastRenderedPageBreak/>
               <w:t>Click of add to cart button</w:t>
             </w:r>
           </w:p>
@@ -6858,8 +7202,13 @@
             <w:tcW w:w="972" w:type="dxa"/>
           </w:tcPr>
           <w:p>
-            <w:r>
-              <w:t>Yes the alerts and code worked correctly</w:t>
+            <w:proofErr w:type="gramStart"/>
+            <w:r>
+              <w:t>Yes</w:t>
+            </w:r>
+            <w:proofErr w:type="gramEnd"/>
+            <w:r>
+              <w:t xml:space="preserve"> the alerts and code worked correctly</w:t>
             </w:r>
           </w:p>
         </w:tc>
@@ -6893,7 +7242,7 @@
                           <pic:cNvPicPr/>
                         </pic:nvPicPr>
                         <pic:blipFill>
-                          <a:blip r:embed="rId76"/>
+                          <a:blip r:embed="rId79"/>
                           <a:stretch>
                             <a:fillRect/>
                           </a:stretch>
@@ -6940,7 +7289,7 @@
                           <pic:cNvPicPr/>
                         </pic:nvPicPr>
                         <pic:blipFill>
-                          <a:blip r:embed="rId77"/>
+                          <a:blip r:embed="rId80"/>
                           <a:stretch>
                             <a:fillRect/>
                           </a:stretch>
@@ -6970,8 +7319,13 @@
             <w:r>
               <w:t xml:space="preserve">The [object Object] resembles the </w:t>
             </w:r>
-            <w:r>
-              <w:t>json dictionary in the outputted array.</w:t>
+            <w:proofErr w:type="spellStart"/>
+            <w:r>
+              <w:t>json</w:t>
+            </w:r>
+            <w:proofErr w:type="spellEnd"/>
+            <w:r>
+              <w:t xml:space="preserve"> dictionary in the outputted array.</w:t>
             </w:r>
           </w:p>
         </w:tc>
@@ -7027,8 +7381,13 @@
             <w:tcW w:w="972" w:type="dxa"/>
           </w:tcPr>
           <w:p>
-            <w:r>
-              <w:t xml:space="preserve">Yes the </w:t>
+            <w:proofErr w:type="gramStart"/>
+            <w:r>
+              <w:t>Yes</w:t>
+            </w:r>
+            <w:proofErr w:type="gramEnd"/>
+            <w:r>
+              <w:t xml:space="preserve"> the </w:t>
             </w:r>
             <w:r>
               <w:t>total price does fully update successfully and accurately</w:t>
@@ -7065,7 +7424,7 @@
                           <pic:cNvPicPr/>
                         </pic:nvPicPr>
                         <pic:blipFill>
-                          <a:blip r:embed="rId78"/>
+                          <a:blip r:embed="rId81"/>
                           <a:stretch>
                             <a:fillRect/>
                           </a:stretch>
@@ -7108,7 +7467,6 @@
         <w:pStyle w:val="Heading1"/>
       </w:pPr>
       <w:r>
-        <w:lastRenderedPageBreak/>
         <w:t>Source Log</w:t>
       </w:r>
     </w:p>
@@ -7200,7 +7558,7 @@
             <w:tcW w:w="2254" w:type="dxa"/>
           </w:tcPr>
           <w:p>
-            <w:hyperlink r:id="rId79" w:history="1">
+            <w:hyperlink r:id="rId82" w:history="1">
               <w:r>
                 <w:rPr>
                   <w:rStyle w:val="Hyperlink"/>
@@ -7219,7 +7577,15 @@
               <w:t xml:space="preserve">Helped </w:t>
             </w:r>
             <w:r>
-              <w:t>find out and understand the &lt;optgroup&gt; tag to organise the option</w:t>
+              <w:t>find out and understand the &lt;</w:t>
+            </w:r>
+            <w:proofErr w:type="spellStart"/>
+            <w:r>
+              <w:t>optgroup</w:t>
+            </w:r>
+            <w:proofErr w:type="spellEnd"/>
+            <w:r>
+              <w:t>&gt; tag to organise the option</w:t>
             </w:r>
             <w:r>
               <w:t>s</w:t>
@@ -7249,7 +7615,15 @@
           </w:tcPr>
           <w:p>
             <w:r>
-              <w:t>Stack Overflow onchange event listener</w:t>
+              <w:t xml:space="preserve">Stack Overflow </w:t>
+            </w:r>
+            <w:proofErr w:type="spellStart"/>
+            <w:r>
+              <w:t>onchange</w:t>
+            </w:r>
+            <w:proofErr w:type="spellEnd"/>
+            <w:r>
+              <w:t xml:space="preserve"> event listener</w:t>
             </w:r>
           </w:p>
         </w:tc>
@@ -7258,120 +7632,48 @@
             <w:tcW w:w="2254" w:type="dxa"/>
           </w:tcPr>
           <w:p>
-            <w:hyperlink r:id="rId80" w:history="1">
+            <w:hyperlink r:id="rId83" w:history="1">
+              <w:proofErr w:type="spellStart"/>
               <w:r>
                 <w:rPr>
                   <w:rStyle w:val="Hyperlink"/>
                 </w:rPr>
-                <w:t>Javascript: onchange or addEventListener? - Stack Overflow</w:t>
+                <w:t>Javascript</w:t>
               </w:r>
-            </w:hyperlink>
-          </w:p>
-        </w:tc>
-        <w:tc>
-          <w:tcPr>
-            <w:tcW w:w="2254" w:type="dxa"/>
-          </w:tcPr>
-          <w:p>
-            <w:r>
-              <w:t>Confirmed the existence of an ‘onchange’ event listener to be used on the select tag</w:t>
-            </w:r>
-          </w:p>
-          <w:p>
-            <w:r>
-              <w:t xml:space="preserve">Search: </w:t>
-            </w:r>
-            <w:r>
-              <w:t>is there an on change event listener</w:t>
-            </w:r>
-          </w:p>
-        </w:tc>
-      </w:tr>
-      <w:tr>
-        <w:tc>
-          <w:tcPr>
-            <w:tcW w:w="2254" w:type="dxa"/>
-          </w:tcPr>
-          <w:p>
-            <w:r>
-              <w:t>SID3</w:t>
-            </w:r>
-          </w:p>
-          <w:p>
-            <w:r>
-              <w:t>27/10/26</w:t>
-            </w:r>
-          </w:p>
-        </w:tc>
-        <w:tc>
-          <w:tcPr>
-            <w:tcW w:w="2254" w:type="dxa"/>
-          </w:tcPr>
-          <w:p/>
-        </w:tc>
-        <w:tc>
-          <w:tcPr>
-            <w:tcW w:w="2254" w:type="dxa"/>
-          </w:tcPr>
-          <w:p/>
-        </w:tc>
-        <w:tc>
-          <w:tcPr>
-            <w:tcW w:w="2254" w:type="dxa"/>
-          </w:tcPr>
-          <w:p>
-            <w:r>
-              <w:t xml:space="preserve">Search: </w:t>
-            </w:r>
-            <w:r>
-              <w:t>how to sort json array in javascript</w:t>
-            </w:r>
-          </w:p>
-        </w:tc>
-      </w:tr>
-      <w:tr>
-        <w:tc>
-          <w:tcPr>
-            <w:tcW w:w="2254" w:type="dxa"/>
-          </w:tcPr>
-          <w:p>
-            <w:r>
-              <w:t>SID4</w:t>
-            </w:r>
-          </w:p>
-          <w:p>
-            <w:r>
-              <w:t>27/10/26</w:t>
-            </w:r>
-          </w:p>
-        </w:tc>
-        <w:tc>
-          <w:tcPr>
-            <w:tcW w:w="2254" w:type="dxa"/>
-          </w:tcPr>
-          <w:p>
-            <w:r>
-              <w:t>Copilot</w:t>
-            </w:r>
-          </w:p>
-        </w:tc>
-        <w:tc>
-          <w:tcPr>
-            <w:tcW w:w="2254" w:type="dxa"/>
-          </w:tcPr>
-          <w:p>
-            <w:r>
-              <w:t>Share Link:</w:t>
-            </w:r>
-            <w:r>
-              <w:br/>
-            </w:r>
-            <w:hyperlink r:id="rId81" w:history="1">
+              <w:proofErr w:type="spellEnd"/>
               <w:r>
                 <w:rPr>
                   <w:rStyle w:val="Hyperlink"/>
                 </w:rPr>
-                <w:t>Why is this code not display a new sorted set of d | Shared Copilot Chat</w:t>
+                <w:t xml:space="preserve">: </w:t>
+              </w:r>
+              <w:proofErr w:type="spellStart"/>
+              <w:r>
+                <w:rPr>
+                  <w:rStyle w:val="Hyperlink"/>
+                </w:rPr>
+                <w:t>onchange</w:t>
+              </w:r>
+              <w:proofErr w:type="spellEnd"/>
+              <w:r>
+                <w:rPr>
+                  <w:rStyle w:val="Hyperlink"/>
+                </w:rPr>
+                <w:t xml:space="preserve"> or </w:t>
+              </w:r>
+              <w:proofErr w:type="spellStart"/>
+              <w:r>
+                <w:rPr>
+                  <w:rStyle w:val="Hyperlink"/>
+                </w:rPr>
+                <w:t>addEventListener</w:t>
+              </w:r>
+              <w:proofErr w:type="spellEnd"/>
+              <w:r>
+                <w:rPr>
+                  <w:rStyle w:val="Hyperlink"/>
+                </w:rPr>
+                <w:t>? - Stack Overflow</w:t>
               </w:r>
             </w:hyperlink>
           </w:p>
@@ -7382,7 +7684,166 @@
           </w:tcPr>
           <w:p>
             <w:r>
-              <w:t xml:space="preserve">The suggestions it made after I gave it my up to date code were helpful and allowed me to finish the functionality </w:t>
+              <w:t>Confirmed the existence of an ‘</w:t>
+            </w:r>
+            <w:proofErr w:type="spellStart"/>
+            <w:r>
+              <w:t>onchange</w:t>
+            </w:r>
+            <w:proofErr w:type="spellEnd"/>
+            <w:r>
+              <w:t>’ event listener to be used on the select tag</w:t>
+            </w:r>
+          </w:p>
+          <w:p>
+            <w:r>
+              <w:t xml:space="preserve">Search: </w:t>
+            </w:r>
+            <w:r>
+              <w:t xml:space="preserve">is there an </w:t>
+            </w:r>
+            <w:proofErr w:type="gramStart"/>
+            <w:r>
+              <w:t>on change</w:t>
+            </w:r>
+            <w:proofErr w:type="gramEnd"/>
+            <w:r>
+              <w:t xml:space="preserve"> event listener</w:t>
+            </w:r>
+          </w:p>
+        </w:tc>
+      </w:tr>
+      <w:tr>
+        <w:tc>
+          <w:tcPr>
+            <w:tcW w:w="2254" w:type="dxa"/>
+          </w:tcPr>
+          <w:p>
+            <w:r>
+              <w:t>SID3</w:t>
+            </w:r>
+          </w:p>
+          <w:p>
+            <w:r>
+              <w:t>27/10/26</w:t>
+            </w:r>
+          </w:p>
+        </w:tc>
+        <w:tc>
+          <w:tcPr>
+            <w:tcW w:w="2254" w:type="dxa"/>
+          </w:tcPr>
+          <w:p/>
+        </w:tc>
+        <w:tc>
+          <w:tcPr>
+            <w:tcW w:w="2254" w:type="dxa"/>
+          </w:tcPr>
+          <w:p/>
+        </w:tc>
+        <w:tc>
+          <w:tcPr>
+            <w:tcW w:w="2254" w:type="dxa"/>
+          </w:tcPr>
+          <w:p>
+            <w:r>
+              <w:t xml:space="preserve">Search: </w:t>
+            </w:r>
+            <w:r>
+              <w:t xml:space="preserve">how to sort </w:t>
+            </w:r>
+            <w:proofErr w:type="spellStart"/>
+            <w:r>
+              <w:t>json</w:t>
+            </w:r>
+            <w:proofErr w:type="spellEnd"/>
+            <w:r>
+              <w:t xml:space="preserve"> array in </w:t>
+            </w:r>
+            <w:proofErr w:type="spellStart"/>
+            <w:r>
+              <w:t>javascript</w:t>
+            </w:r>
+            <w:proofErr w:type="spellEnd"/>
+          </w:p>
+        </w:tc>
+      </w:tr>
+      <w:tr>
+        <w:tc>
+          <w:tcPr>
+            <w:tcW w:w="2254" w:type="dxa"/>
+          </w:tcPr>
+          <w:p>
+            <w:r>
+              <w:t>SID4</w:t>
+            </w:r>
+          </w:p>
+          <w:p>
+            <w:r>
+              <w:t>27/10/26</w:t>
+            </w:r>
+          </w:p>
+        </w:tc>
+        <w:tc>
+          <w:tcPr>
+            <w:tcW w:w="2254" w:type="dxa"/>
+          </w:tcPr>
+          <w:p>
+            <w:r>
+              <w:t>Copilot</w:t>
+            </w:r>
+          </w:p>
+        </w:tc>
+        <w:tc>
+          <w:tcPr>
+            <w:tcW w:w="2254" w:type="dxa"/>
+          </w:tcPr>
+          <w:p>
+            <w:r>
+              <w:t>Share Link:</w:t>
+            </w:r>
+            <w:r>
+              <w:br/>
+            </w:r>
+            <w:hyperlink r:id="rId84" w:history="1">
+              <w:r>
+                <w:rPr>
+                  <w:rStyle w:val="Hyperlink"/>
+                </w:rPr>
+                <w:t xml:space="preserve">Why is this code </w:t>
+              </w:r>
+              <w:proofErr w:type="gramStart"/>
+              <w:r>
+                <w:rPr>
+                  <w:rStyle w:val="Hyperlink"/>
+                </w:rPr>
+                <w:t>not display</w:t>
+              </w:r>
+              <w:proofErr w:type="gramEnd"/>
+              <w:r>
+                <w:rPr>
+                  <w:rStyle w:val="Hyperlink"/>
+                </w:rPr>
+                <w:t xml:space="preserve"> a new sorted set of d | Shared Copilot Chat</w:t>
+              </w:r>
+            </w:hyperlink>
+          </w:p>
+        </w:tc>
+        <w:tc>
+          <w:tcPr>
+            <w:tcW w:w="2254" w:type="dxa"/>
+          </w:tcPr>
+          <w:p>
+            <w:r>
+              <w:t xml:space="preserve">The suggestions it made after I gave it my </w:t>
+            </w:r>
+            <w:proofErr w:type="gramStart"/>
+            <w:r>
+              <w:t>up to date</w:t>
+            </w:r>
+            <w:proofErr w:type="gramEnd"/>
+            <w:r>
+              <w:t xml:space="preserve"> code were helpful and allowed me to finish the functionality </w:t>
             </w:r>
             <w:r>
               <w:t>of the product sorting.</w:t>

</xml_diff>